<commit_message>
Refresh CV and resume document content.
EOF

Co-authored-by: Cursor <cursoragent@cursor.com>
</commit_message>
<xml_diff>
--- a/CV_zyrr.docx
+++ b/CV_zyrr.docx
@@ -45,6 +45,17 @@
       </w:r>
       <w:r>
         <w:rPr>
+          <w:rFonts w:hint="eastAsia" w:ascii="Times New Roman" w:hAnsi="Times New Roman" w:eastAsia="宋体" w:cs="Times New Roman"/>
+          <w:b/>
+          <w:bCs/>
+          <w:sz w:val="22"/>
+          <w:szCs w:val="22"/>
+          <w:lang w:val="en-US" w:eastAsia="zh-CN"/>
+        </w:rPr>
+        <w:t xml:space="preserve">  </w:t>
+      </w:r>
+      <w:r>
+        <w:rPr>
           <w:rFonts w:ascii="Times New Roman" w:hAnsi="Times New Roman" w:eastAsia="宋体" w:cs="Times New Roman"/>
           <w:sz w:val="22"/>
           <w:szCs w:val="22"/>
@@ -243,6 +254,17 @@
       </w:r>
       <w:r>
         <w:rPr>
+          <w:rFonts w:hint="eastAsia" w:ascii="Times New Roman" w:hAnsi="Times New Roman" w:eastAsia="宋体" w:cs="Times New Roman"/>
+          <w:b/>
+          <w:bCs/>
+          <w:sz w:val="22"/>
+          <w:szCs w:val="22"/>
+          <w:lang w:val="en-US" w:eastAsia="zh-CN"/>
+        </w:rPr>
+        <w:t xml:space="preserve">  </w:t>
+      </w:r>
+      <w:r>
+        <w:rPr>
           <w:rFonts w:ascii="Times New Roman" w:hAnsi="Times New Roman" w:eastAsia="宋体" w:cs="Times New Roman"/>
           <w:sz w:val="22"/>
           <w:szCs w:val="22"/>
@@ -365,10 +387,11 @@
         </w:pBdr>
         <w:spacing w:after="100"/>
         <w:rPr>
-          <w:rFonts w:ascii="Times New Roman" w:hAnsi="Times New Roman" w:cs="Times New Roman"/>
+          <w:rFonts w:hint="default" w:ascii="Times New Roman" w:hAnsi="Times New Roman" w:cs="Times New Roman"/>
           <w:b/>
           <w:sz w:val="24"/>
           <w:shd w:val="pct15" w:color="auto" w:fill="FFFFFF"/>
+          <w:lang w:val="en-US"/>
         </w:rPr>
       </w:pPr>
       <w:r>
@@ -378,148 +401,17 @@
           <w:sz w:val="24"/>
           <w:shd w:val="pct15" w:color="auto" w:fill="FFFFFF"/>
         </w:rPr>
-        <w:t>RESEARCH INTERESTS</w:t>
-      </w:r>
-    </w:p>
-    <w:p>
-      <w:pPr>
-        <w:tabs>
-          <w:tab w:val="left" w:pos="170"/>
-        </w:tabs>
-        <w:rPr>
-          <w:rFonts w:ascii="Times New Roman" w:hAnsi="Times New Roman" w:cs="Times New Roman"/>
+        <w:t>RESEARCH S</w:t>
+      </w:r>
+      <w:r>
+        <w:rPr>
+          <w:rFonts w:hint="default" w:ascii="Times New Roman" w:hAnsi="Times New Roman" w:cs="Times New Roman"/>
+          <w:b/>
           <w:sz w:val="24"/>
-        </w:rPr>
-      </w:pPr>
-      <w:r>
-        <w:rPr>
-          <w:rFonts w:ascii="Times New Roman" w:hAnsi="Times New Roman" w:cs="Times New Roman"/>
-          <w:sz w:val="24"/>
-        </w:rPr>
-        <w:t xml:space="preserve">[1] AI-driven </w:t>
-      </w:r>
-      <w:r>
-        <w:rPr>
-          <w:rFonts w:hint="default" w:ascii="Times New Roman" w:hAnsi="Times New Roman" w:cs="Times New Roman"/>
-          <w:sz w:val="24"/>
+          <w:shd w:val="pct15" w:color="auto" w:fill="FFFFFF"/>
           <w:lang w:val="en-US"/>
         </w:rPr>
-        <w:t>c</w:t>
-      </w:r>
-      <w:r>
-        <w:rPr>
-          <w:rFonts w:hint="eastAsia" w:ascii="Times New Roman" w:hAnsi="Times New Roman" w:cs="Times New Roman"/>
-          <w:sz w:val="24"/>
-        </w:rPr>
-        <w:t>losed-loop Design-Build-Test-Learn workflow</w:t>
-      </w:r>
-      <w:r>
-        <w:rPr>
-          <w:rFonts w:hint="default" w:ascii="Times New Roman" w:hAnsi="Times New Roman" w:cs="Times New Roman"/>
-          <w:sz w:val="24"/>
-          <w:lang w:val="en-US"/>
-        </w:rPr>
-        <w:t xml:space="preserve"> for</w:t>
-      </w:r>
-      <w:r>
-        <w:rPr>
-          <w:rFonts w:ascii="Times New Roman" w:hAnsi="Times New Roman" w:cs="Times New Roman"/>
-          <w:sz w:val="24"/>
-        </w:rPr>
-        <w:t xml:space="preserve"> microfluidic systems</w:t>
-      </w:r>
-    </w:p>
-    <w:p>
-      <w:pPr>
-        <w:tabs>
-          <w:tab w:val="left" w:pos="170"/>
-        </w:tabs>
-        <w:rPr>
-          <w:rFonts w:ascii="Times New Roman" w:hAnsi="Times New Roman" w:cs="Times New Roman"/>
-          <w:sz w:val="24"/>
-        </w:rPr>
-      </w:pPr>
-      <w:r>
-        <w:rPr>
-          <w:rFonts w:ascii="Times New Roman" w:hAnsi="Times New Roman" w:cs="Times New Roman"/>
-          <w:sz w:val="24"/>
-        </w:rPr>
-        <w:t>[2] Constraint-based optimization and graph algorithms for multicellular computation</w:t>
-      </w:r>
-    </w:p>
-    <w:p>
-      <w:pPr>
-        <w:tabs>
-          <w:tab w:val="left" w:pos="170"/>
-        </w:tabs>
-        <w:rPr>
-          <w:rFonts w:hint="default" w:ascii="Times New Roman" w:hAnsi="Times New Roman" w:cs="Times New Roman"/>
-          <w:sz w:val="24"/>
-          <w:lang w:val="en-US"/>
-        </w:rPr>
-      </w:pPr>
-      <w:r>
-        <w:rPr>
-          <w:rFonts w:ascii="Times New Roman" w:hAnsi="Times New Roman" w:cs="Times New Roman"/>
-          <w:sz w:val="24"/>
-        </w:rPr>
-        <w:t>[3] Formal verification and CAD</w:t>
-      </w:r>
-      <w:r>
-        <w:rPr>
-          <w:rFonts w:hint="default" w:ascii="Times New Roman" w:hAnsi="Times New Roman" w:cs="Times New Roman"/>
-          <w:sz w:val="24"/>
-          <w:lang w:val="en-US"/>
-        </w:rPr>
-        <w:t xml:space="preserve"> software </w:t>
-      </w:r>
-      <w:r>
-        <w:rPr>
-          <w:rFonts w:ascii="Times New Roman" w:hAnsi="Times New Roman" w:cs="Times New Roman"/>
-          <w:sz w:val="24"/>
-        </w:rPr>
-        <w:t xml:space="preserve">infrastructures for biological </w:t>
-      </w:r>
-      <w:r>
-        <w:rPr>
-          <w:rFonts w:hint="default" w:ascii="Times New Roman" w:hAnsi="Times New Roman" w:cs="Times New Roman"/>
-          <w:sz w:val="24"/>
-          <w:lang w:val="en-US"/>
-        </w:rPr>
-        <w:t>design</w:t>
-      </w:r>
-    </w:p>
-    <w:p>
-      <w:pPr>
-        <w:tabs>
-          <w:tab w:val="left" w:pos="170"/>
-        </w:tabs>
-        <w:rPr>
-          <w:rFonts w:ascii="Times New Roman" w:hAnsi="Times New Roman" w:cs="Times New Roman"/>
-          <w:sz w:val="24"/>
-        </w:rPr>
-      </w:pPr>
-      <w:r>
-        <w:rPr>
-          <w:rFonts w:ascii="Times New Roman" w:hAnsi="Times New Roman" w:cs="Times New Roman"/>
-          <w:sz w:val="24"/>
-        </w:rPr>
-        <w:t xml:space="preserve">[4] Large language model (LLM)-enabled </w:t>
-      </w:r>
-      <w:r>
-        <w:rPr>
-          <w:rFonts w:hint="default" w:ascii="Times New Roman" w:hAnsi="Times New Roman" w:cs="Times New Roman"/>
-          <w:sz w:val="24"/>
-          <w:lang w:val="en-US"/>
-        </w:rPr>
-        <w:t>next generation biological</w:t>
-      </w:r>
-      <w:r>
-        <w:rPr>
-          <w:rFonts w:ascii="Times New Roman" w:hAnsi="Times New Roman" w:cs="Times New Roman"/>
-          <w:sz w:val="24"/>
-        </w:rPr>
-        <w:t xml:space="preserve"> design automation</w:t>
+        <w:t>UMMARY</w:t>
       </w:r>
     </w:p>
     <w:p>
@@ -535,40 +427,17 @@
       </w:pPr>
       <w:r>
         <w:rPr>
-          <w:rFonts w:ascii="Times New Roman" w:hAnsi="Times New Roman" w:cs="Times New Roman"/>
+          <w:rFonts w:hint="eastAsia" w:ascii="Times New Roman" w:hAnsi="Times New Roman" w:cs="Times New Roman"/>
           <w:sz w:val="24"/>
         </w:rPr>
-        <w:t xml:space="preserve">[5] </w:t>
-      </w:r>
-      <w:r>
-        <w:rPr>
-          <w:rFonts w:hint="default" w:ascii="Times New Roman" w:hAnsi="Times New Roman" w:cs="Times New Roman"/>
+        <w:t>Computer scientist developing algorithms, programming languages, and AI-driven software infrastructures for biological engineering. My research focuses on translating complex biological design problems into computational abstractions that enable optimization, automation, and scalable scientific discovery.</w:t>
+      </w:r>
+      <w:r>
+        <w:rPr>
+          <w:rFonts w:ascii="Times New Roman" w:hAnsi="Times New Roman" w:cs="Times New Roman"/>
           <w:sz w:val="24"/>
-          <w:lang w:val="en-US"/>
-        </w:rPr>
-        <w:t>Self</w:t>
-      </w:r>
-      <w:r>
-        <w:rPr>
-          <w:rFonts w:ascii="Times New Roman" w:hAnsi="Times New Roman" w:cs="Times New Roman"/>
-          <w:sz w:val="24"/>
-        </w:rPr>
-        <w:t>-driv</w:t>
-      </w:r>
-      <w:r>
-        <w:rPr>
-          <w:rFonts w:hint="default" w:ascii="Times New Roman" w:hAnsi="Times New Roman" w:cs="Times New Roman"/>
-          <w:sz w:val="24"/>
-          <w:lang w:val="en-US"/>
-        </w:rPr>
-        <w:t xml:space="preserve">ing laboratories </w:t>
-      </w:r>
-      <w:r>
-        <w:rPr>
-          <w:rFonts w:ascii="Times New Roman" w:hAnsi="Times New Roman" w:cs="Times New Roman"/>
-          <w:sz w:val="24"/>
-        </w:rPr>
-        <w:t xml:space="preserve">for programmable biological systems </w:t>
+        </w:rPr>
+        <w:t xml:space="preserve"> </w:t>
       </w:r>
     </w:p>
     <w:p>
@@ -584,7 +453,6 @@
           <w:shd w:val="pct15" w:color="auto" w:fill="FFFFFF"/>
         </w:rPr>
       </w:pPr>
-      <w:bookmarkStart w:id="0" w:name="OLE_LINK7"/>
       <w:r>
         <w:rPr>
           <w:rFonts w:ascii="Times New Roman" w:hAnsi="Times New Roman" w:cs="Times New Roman"/>
@@ -592,533 +460,137 @@
           <w:sz w:val="24"/>
           <w:shd w:val="pct15" w:color="auto" w:fill="FFFFFF"/>
         </w:rPr>
-        <w:t>AWARDS &amp; HONORS</w:t>
-      </w:r>
-    </w:p>
-    <w:p>
-      <w:pPr>
-        <w:jc w:val="distribute"/>
-        <w:rPr>
-          <w:rFonts w:ascii="Times New Roman" w:hAnsi="Times New Roman" w:eastAsia="宋体" w:cs="Times New Roman"/>
-          <w:sz w:val="22"/>
-          <w:szCs w:val="22"/>
-        </w:rPr>
-      </w:pPr>
-      <w:r>
-        <w:rPr>
-          <w:rFonts w:hint="eastAsia" w:ascii="Times New Roman" w:hAnsi="Times New Roman" w:eastAsia="宋体" w:cs="Times New Roman"/>
-          <w:sz w:val="22"/>
-          <w:szCs w:val="22"/>
-        </w:rPr>
-        <w:t>iGEM</w:t>
-      </w:r>
-      <w:r>
-        <w:rPr>
-          <w:rFonts w:ascii="Times New Roman" w:hAnsi="Times New Roman" w:eastAsia="宋体" w:cs="Times New Roman"/>
-          <w:sz w:val="22"/>
-          <w:szCs w:val="22"/>
-        </w:rPr>
-        <w:t xml:space="preserve"> "</w:t>
-      </w:r>
-      <w:r>
-        <w:rPr>
-          <w:rFonts w:ascii="Times New Roman" w:hAnsi="Times New Roman" w:eastAsia="宋体" w:cs="Times New Roman"/>
-          <w:b/>
-          <w:bCs/>
-          <w:sz w:val="22"/>
-          <w:szCs w:val="22"/>
-        </w:rPr>
-        <w:t>Gold medal</w:t>
-      </w:r>
-      <w:r>
-        <w:rPr>
-          <w:rFonts w:ascii="Times New Roman" w:hAnsi="Times New Roman" w:eastAsia="宋体" w:cs="Times New Roman"/>
-          <w:sz w:val="22"/>
-          <w:szCs w:val="22"/>
-        </w:rPr>
-        <w:t xml:space="preserve">" (Student Mentor, wiki: </w:t>
-      </w:r>
-      <w:r>
-        <w:fldChar w:fldCharType="begin"/>
-      </w:r>
-      <w:r>
-        <w:instrText xml:space="preserve"> HYPERLINK "https://2024.igem.wiki/bostonu/" </w:instrText>
-      </w:r>
-      <w:r>
-        <w:fldChar w:fldCharType="separate"/>
-      </w:r>
-      <w:r>
-        <w:rPr>
-          <w:rStyle w:val="7"/>
-          <w:rFonts w:ascii="Times New Roman" w:hAnsi="Times New Roman" w:eastAsia="宋体" w:cs="Times New Roman"/>
-          <w:sz w:val="22"/>
-          <w:szCs w:val="22"/>
-        </w:rPr>
-        <w:t>https://2024.igem.wiki/bostonu/</w:t>
-      </w:r>
-      <w:r>
-        <w:rPr>
-          <w:rStyle w:val="7"/>
-          <w:rFonts w:ascii="Times New Roman" w:hAnsi="Times New Roman" w:eastAsia="宋体" w:cs="Times New Roman"/>
-          <w:sz w:val="22"/>
-          <w:szCs w:val="22"/>
-        </w:rPr>
-        <w:fldChar w:fldCharType="end"/>
-      </w:r>
-      <w:r>
-        <w:rPr>
-          <w:rFonts w:ascii="Times New Roman" w:hAnsi="Times New Roman" w:eastAsia="宋体" w:cs="Times New Roman"/>
-          <w:sz w:val="22"/>
-          <w:szCs w:val="22"/>
-        </w:rPr>
-        <w:t xml:space="preserve">)                                                     </w:t>
-      </w:r>
-      <w:r>
-        <w:rPr>
-          <w:rFonts w:hint="default" w:ascii="Times New Roman" w:hAnsi="Times New Roman" w:eastAsia="宋体" w:cs="Times New Roman"/>
-          <w:sz w:val="22"/>
-          <w:szCs w:val="22"/>
+        <w:t>RESEARCH INTERESTS</w:t>
+      </w:r>
+    </w:p>
+    <w:p>
+      <w:pPr>
+        <w:tabs>
+          <w:tab w:val="left" w:pos="170"/>
+        </w:tabs>
+        <w:rPr>
+          <w:rFonts w:ascii="Times New Roman" w:hAnsi="Times New Roman" w:cs="Times New Roman"/>
+          <w:sz w:val="24"/>
+        </w:rPr>
+      </w:pPr>
+      <w:r>
+        <w:rPr>
+          <w:rFonts w:ascii="Times New Roman" w:hAnsi="Times New Roman" w:cs="Times New Roman"/>
+          <w:sz w:val="24"/>
+        </w:rPr>
+        <w:t xml:space="preserve">[1] </w:t>
+      </w:r>
+      <w:r>
+        <w:rPr>
+          <w:rFonts w:hint="eastAsia" w:ascii="Times New Roman" w:hAnsi="Times New Roman" w:cs="Times New Roman"/>
+          <w:sz w:val="24"/>
+        </w:rPr>
+        <w:t>Computational methods for biological engineering</w:t>
+      </w:r>
+    </w:p>
+    <w:p>
+      <w:pPr>
+        <w:tabs>
+          <w:tab w:val="left" w:pos="170"/>
+        </w:tabs>
+        <w:rPr>
+          <w:rFonts w:ascii="Times New Roman" w:hAnsi="Times New Roman" w:cs="Times New Roman"/>
+          <w:sz w:val="24"/>
+        </w:rPr>
+      </w:pPr>
+      <w:r>
+        <w:rPr>
+          <w:rFonts w:ascii="Times New Roman" w:hAnsi="Times New Roman" w:cs="Times New Roman"/>
+          <w:sz w:val="24"/>
+        </w:rPr>
+        <w:t>[2] Constraint-based optimization and graph algorithms for multicellular computation</w:t>
+      </w:r>
+    </w:p>
+    <w:p>
+      <w:pPr>
+        <w:tabs>
+          <w:tab w:val="left" w:pos="170"/>
+        </w:tabs>
+        <w:rPr>
+          <w:rFonts w:hint="default" w:ascii="Times New Roman" w:hAnsi="Times New Roman" w:cs="Times New Roman"/>
+          <w:sz w:val="24"/>
           <w:lang w:val="en-US"/>
         </w:rPr>
-        <w:t xml:space="preserve">     </w:t>
-      </w:r>
-      <w:r>
-        <w:rPr>
-          <w:rFonts w:ascii="Times New Roman" w:hAnsi="Times New Roman" w:eastAsia="宋体" w:cs="Times New Roman"/>
-          <w:sz w:val="22"/>
-          <w:szCs w:val="22"/>
-        </w:rPr>
-        <w:t>11/2024</w:t>
-      </w:r>
-    </w:p>
-    <w:p>
-      <w:pPr>
-        <w:jc w:val="distribute"/>
-        <w:rPr>
-          <w:rFonts w:ascii="Times New Roman" w:hAnsi="Times New Roman" w:eastAsia="宋体" w:cs="Times New Roman"/>
-          <w:bCs/>
-          <w:sz w:val="22"/>
-          <w:szCs w:val="22"/>
-        </w:rPr>
-      </w:pPr>
-      <w:r>
-        <w:rPr>
-          <w:rFonts w:ascii="Times New Roman" w:hAnsi="Times New Roman" w:eastAsia="宋体" w:cs="Times New Roman"/>
-          <w:bCs/>
-          <w:sz w:val="22"/>
-          <w:szCs w:val="22"/>
-        </w:rPr>
-        <w:t>China Youth Science and Technology Innovation Award</w:t>
-      </w:r>
-      <w:r>
-        <w:rPr>
-          <w:rFonts w:hint="eastAsia" w:ascii="Times New Roman" w:hAnsi="Times New Roman" w:eastAsia="宋体" w:cs="Times New Roman"/>
-          <w:bCs/>
-          <w:sz w:val="22"/>
-          <w:szCs w:val="22"/>
-        </w:rPr>
-        <w:t xml:space="preserve"> (</w:t>
-      </w:r>
-      <w:r>
-        <w:rPr>
-          <w:rFonts w:ascii="Times New Roman" w:hAnsi="Times New Roman" w:eastAsia="宋体" w:cs="Times New Roman"/>
-          <w:bCs/>
-          <w:sz w:val="22"/>
-          <w:szCs w:val="22"/>
-        </w:rPr>
-        <w:t>Nominated by UESTC</w:t>
-      </w:r>
-      <w:r>
-        <w:rPr>
-          <w:rFonts w:hint="eastAsia" w:ascii="Times New Roman" w:hAnsi="Times New Roman" w:eastAsia="宋体" w:cs="Times New Roman"/>
-          <w:bCs/>
-          <w:sz w:val="22"/>
-          <w:szCs w:val="22"/>
-        </w:rPr>
-        <w:t xml:space="preserve">)                                                   </w:t>
-      </w:r>
-      <w:r>
-        <w:rPr>
-          <w:rFonts w:ascii="Times New Roman" w:hAnsi="Times New Roman" w:eastAsia="宋体" w:cs="Times New Roman"/>
-          <w:bCs/>
-          <w:sz w:val="22"/>
-          <w:szCs w:val="22"/>
-        </w:rPr>
-        <w:t xml:space="preserve">  </w:t>
-      </w:r>
-      <w:r>
-        <w:rPr>
-          <w:rFonts w:hint="eastAsia" w:ascii="Times New Roman" w:hAnsi="Times New Roman" w:eastAsia="宋体" w:cs="Times New Roman"/>
-          <w:bCs/>
-          <w:sz w:val="22"/>
-          <w:szCs w:val="22"/>
-        </w:rPr>
-        <w:t>05</w:t>
-      </w:r>
-      <w:r>
-        <w:rPr>
-          <w:rFonts w:ascii="Times New Roman" w:hAnsi="Times New Roman" w:eastAsia="宋体" w:cs="Times New Roman"/>
-          <w:bCs/>
-          <w:sz w:val="22"/>
-          <w:szCs w:val="22"/>
-        </w:rPr>
-        <w:t>/</w:t>
-      </w:r>
-      <w:r>
-        <w:rPr>
-          <w:rFonts w:hint="eastAsia" w:ascii="Times New Roman" w:hAnsi="Times New Roman" w:eastAsia="宋体" w:cs="Times New Roman"/>
-          <w:bCs/>
-          <w:sz w:val="22"/>
-          <w:szCs w:val="22"/>
-        </w:rPr>
-        <w:t>2020</w:t>
-      </w:r>
-    </w:p>
-    <w:p>
-      <w:pPr>
-        <w:jc w:val="distribute"/>
-        <w:rPr>
-          <w:rFonts w:ascii="Times New Roman" w:hAnsi="Times New Roman" w:eastAsia="宋体" w:cs="Times New Roman"/>
-          <w:sz w:val="22"/>
-          <w:szCs w:val="22"/>
-        </w:rPr>
-      </w:pPr>
-      <w:r>
-        <w:rPr>
-          <w:rFonts w:ascii="Times New Roman" w:hAnsi="Times New Roman" w:eastAsia="宋体" w:cs="Times New Roman"/>
-          <w:b/>
-          <w:bCs/>
-          <w:sz w:val="22"/>
-          <w:szCs w:val="22"/>
-        </w:rPr>
-        <w:t>Most Outstanding Students of UESTC 2019</w:t>
-      </w:r>
-      <w:r>
-        <w:rPr>
-          <w:rFonts w:ascii="Times New Roman" w:hAnsi="Times New Roman" w:eastAsia="宋体" w:cs="Times New Roman"/>
-          <w:sz w:val="22"/>
-          <w:szCs w:val="22"/>
-        </w:rPr>
-        <w:t xml:space="preserve"> (成电杰出学生, </w:t>
-      </w:r>
-      <w:r>
-        <w:rPr>
-          <w:rFonts w:ascii="Times New Roman" w:hAnsi="Times New Roman" w:eastAsia="宋体" w:cs="Times New Roman"/>
-          <w:b/>
-          <w:bCs/>
-          <w:sz w:val="22"/>
-          <w:szCs w:val="22"/>
-        </w:rPr>
-        <w:t>10/5000</w:t>
-      </w:r>
-      <w:r>
-        <w:rPr>
-          <w:rFonts w:ascii="Times New Roman" w:hAnsi="Times New Roman" w:eastAsia="宋体" w:cs="Times New Roman"/>
-          <w:sz w:val="22"/>
-          <w:szCs w:val="22"/>
-        </w:rPr>
-        <w:t xml:space="preserve"> in UESTC, </w:t>
-      </w:r>
-      <w:r>
-        <w:rPr>
-          <w:rFonts w:ascii="Times New Roman" w:hAnsi="Times New Roman" w:eastAsia="宋体" w:cs="Times New Roman"/>
-          <w:b/>
-          <w:bCs/>
-          <w:sz w:val="22"/>
-          <w:szCs w:val="22"/>
-        </w:rPr>
-        <w:t>1/740</w:t>
-      </w:r>
-      <w:r>
-        <w:rPr>
-          <w:rFonts w:ascii="Times New Roman" w:hAnsi="Times New Roman" w:eastAsia="宋体" w:cs="Times New Roman"/>
-          <w:sz w:val="22"/>
-          <w:szCs w:val="22"/>
-        </w:rPr>
-        <w:t xml:space="preserve"> in department)         </w:t>
-      </w:r>
-      <w:r>
-        <w:rPr>
-          <w:rFonts w:hint="default" w:ascii="Times New Roman" w:hAnsi="Times New Roman" w:eastAsia="宋体" w:cs="Times New Roman"/>
-          <w:sz w:val="22"/>
-          <w:szCs w:val="22"/>
+      </w:pPr>
+      <w:r>
+        <w:rPr>
+          <w:rFonts w:ascii="Times New Roman" w:hAnsi="Times New Roman" w:cs="Times New Roman"/>
+          <w:sz w:val="24"/>
+        </w:rPr>
+        <w:t xml:space="preserve">[3] </w:t>
+      </w:r>
+      <w:r>
+        <w:rPr>
+          <w:rFonts w:hint="eastAsia" w:ascii="Times New Roman" w:hAnsi="Times New Roman" w:cs="Times New Roman"/>
+          <w:sz w:val="24"/>
+        </w:rPr>
+        <w:t>AI-driven scientific design automation</w:t>
+      </w:r>
+    </w:p>
+    <w:p>
+      <w:pPr>
+        <w:tabs>
+          <w:tab w:val="left" w:pos="170"/>
+        </w:tabs>
+        <w:rPr>
+          <w:rFonts w:ascii="Times New Roman" w:hAnsi="Times New Roman" w:cs="Times New Roman"/>
+          <w:sz w:val="24"/>
+        </w:rPr>
+      </w:pPr>
+      <w:r>
+        <w:rPr>
+          <w:rFonts w:ascii="Times New Roman" w:hAnsi="Times New Roman" w:cs="Times New Roman"/>
+          <w:sz w:val="24"/>
+        </w:rPr>
+        <w:t xml:space="preserve">[4] </w:t>
+      </w:r>
+      <w:r>
+        <w:rPr>
+          <w:rFonts w:hint="eastAsia" w:ascii="Times New Roman" w:hAnsi="Times New Roman" w:cs="Times New Roman"/>
+          <w:sz w:val="24"/>
+        </w:rPr>
+        <w:t>Compiler and programming language design for scientific applications</w:t>
+      </w:r>
+    </w:p>
+    <w:p>
+      <w:pPr>
+        <w:tabs>
+          <w:tab w:val="left" w:pos="170"/>
+        </w:tabs>
+        <w:spacing w:after="200"/>
+        <w:rPr>
+          <w:rFonts w:ascii="Times New Roman" w:hAnsi="Times New Roman" w:cs="Times New Roman"/>
+          <w:sz w:val="24"/>
+        </w:rPr>
+      </w:pPr>
+      <w:r>
+        <w:rPr>
+          <w:rFonts w:ascii="Times New Roman" w:hAnsi="Times New Roman" w:cs="Times New Roman"/>
+          <w:sz w:val="24"/>
+        </w:rPr>
+        <w:t xml:space="preserve">[5] </w:t>
+      </w:r>
+      <w:r>
+        <w:rPr>
+          <w:rFonts w:hint="default" w:ascii="Times New Roman" w:hAnsi="Times New Roman" w:cs="Times New Roman"/>
+          <w:sz w:val="24"/>
           <w:lang w:val="en-US"/>
         </w:rPr>
-        <w:t xml:space="preserve">   </w:t>
-      </w:r>
-      <w:r>
-        <w:rPr>
-          <w:rFonts w:ascii="Times New Roman" w:hAnsi="Times New Roman" w:eastAsia="宋体" w:cs="Times New Roman"/>
-          <w:sz w:val="22"/>
-          <w:szCs w:val="22"/>
-        </w:rPr>
-        <w:t xml:space="preserve"> 12/2019</w:t>
-      </w:r>
-    </w:p>
-    <w:p>
-      <w:pPr>
-        <w:jc w:val="distribute"/>
-        <w:rPr>
-          <w:rFonts w:ascii="Times New Roman" w:hAnsi="Times New Roman" w:eastAsia="宋体" w:cs="Times New Roman"/>
-          <w:sz w:val="22"/>
-          <w:szCs w:val="22"/>
-        </w:rPr>
-      </w:pPr>
-      <w:r>
-        <w:rPr>
-          <w:rFonts w:ascii="Times New Roman" w:hAnsi="Times New Roman" w:eastAsia="宋体" w:cs="Times New Roman"/>
-          <w:sz w:val="22"/>
-          <w:szCs w:val="22"/>
-        </w:rPr>
-        <w:t>iGEM "</w:t>
-      </w:r>
-      <w:r>
-        <w:rPr>
-          <w:rFonts w:ascii="Times New Roman" w:hAnsi="Times New Roman" w:eastAsia="宋体" w:cs="Times New Roman"/>
-          <w:b/>
-          <w:bCs/>
-          <w:sz w:val="22"/>
-          <w:szCs w:val="22"/>
-        </w:rPr>
-        <w:t>Gold medal</w:t>
-      </w:r>
-      <w:r>
-        <w:rPr>
-          <w:rFonts w:ascii="Times New Roman" w:hAnsi="Times New Roman" w:eastAsia="宋体" w:cs="Times New Roman"/>
-          <w:sz w:val="22"/>
-          <w:szCs w:val="22"/>
-        </w:rPr>
-        <w:t>" and "</w:t>
-      </w:r>
-      <w:r>
-        <w:rPr>
-          <w:rFonts w:ascii="Times New Roman" w:hAnsi="Times New Roman" w:eastAsia="宋体" w:cs="Times New Roman"/>
-          <w:b/>
-          <w:bCs/>
-          <w:sz w:val="22"/>
-          <w:szCs w:val="22"/>
-        </w:rPr>
-        <w:t>Best Software Project</w:t>
-      </w:r>
-      <w:r>
-        <w:rPr>
-          <w:rFonts w:ascii="Times New Roman" w:hAnsi="Times New Roman" w:eastAsia="宋体" w:cs="Times New Roman"/>
-          <w:sz w:val="22"/>
-          <w:szCs w:val="22"/>
-        </w:rPr>
-        <w:t xml:space="preserve">" (wiki: </w:t>
-      </w:r>
-      <w:r>
-        <w:fldChar w:fldCharType="begin"/>
-      </w:r>
-      <w:r>
-        <w:instrText xml:space="preserve"> HYPERLINK "https://2019.igem.org/Team:UESTC-Software" </w:instrText>
-      </w:r>
-      <w:r>
-        <w:fldChar w:fldCharType="separate"/>
-      </w:r>
-      <w:r>
-        <w:rPr>
-          <w:rStyle w:val="7"/>
-          <w:rFonts w:ascii="Times New Roman" w:hAnsi="Times New Roman" w:eastAsia="宋体" w:cs="Times New Roman"/>
-          <w:sz w:val="22"/>
-          <w:szCs w:val="22"/>
-        </w:rPr>
-        <w:t>https://2019.igem.org/Team:UESTC-Software</w:t>
-      </w:r>
-      <w:r>
-        <w:rPr>
-          <w:rStyle w:val="7"/>
-          <w:rFonts w:ascii="Times New Roman" w:hAnsi="Times New Roman" w:eastAsia="宋体" w:cs="Times New Roman"/>
-          <w:sz w:val="22"/>
-          <w:szCs w:val="22"/>
-        </w:rPr>
-        <w:fldChar w:fldCharType="end"/>
-      </w:r>
-      <w:r>
-        <w:rPr>
-          <w:rFonts w:ascii="Times New Roman" w:hAnsi="Times New Roman" w:eastAsia="宋体" w:cs="Times New Roman"/>
-          <w:sz w:val="22"/>
-          <w:szCs w:val="22"/>
-        </w:rPr>
-        <w:t>)</w:t>
-      </w:r>
-      <w:r>
-        <w:rPr>
-          <w:rFonts w:ascii="Times New Roman" w:hAnsi="Times New Roman" w:eastAsia="宋体" w:cs="Times New Roman"/>
-          <w:sz w:val="22"/>
-          <w:szCs w:val="22"/>
-        </w:rPr>
-        <w:tab/>
-      </w:r>
-      <w:r>
-        <w:rPr>
-          <w:rFonts w:ascii="Times New Roman" w:hAnsi="Times New Roman" w:eastAsia="宋体" w:cs="Times New Roman"/>
-          <w:sz w:val="22"/>
-          <w:szCs w:val="22"/>
-        </w:rPr>
-        <w:t xml:space="preserve">       </w:t>
-      </w:r>
-      <w:r>
-        <w:rPr>
-          <w:rFonts w:hint="default" w:ascii="Times New Roman" w:hAnsi="Times New Roman" w:eastAsia="宋体" w:cs="Times New Roman"/>
-          <w:sz w:val="22"/>
-          <w:szCs w:val="22"/>
-          <w:lang w:val="en-US"/>
-        </w:rPr>
-        <w:t xml:space="preserve">      </w:t>
-      </w:r>
-      <w:r>
-        <w:rPr>
-          <w:rFonts w:ascii="Times New Roman" w:hAnsi="Times New Roman" w:eastAsia="宋体" w:cs="Times New Roman"/>
-          <w:sz w:val="22"/>
-          <w:szCs w:val="22"/>
-        </w:rPr>
-        <w:t>11/2019</w:t>
-      </w:r>
-    </w:p>
-    <w:p>
-      <w:pPr>
-        <w:jc w:val="distribute"/>
-        <w:rPr>
-          <w:rFonts w:ascii="Times New Roman" w:hAnsi="Times New Roman" w:eastAsia="宋体" w:cs="Times New Roman"/>
-          <w:i/>
-          <w:iCs/>
-          <w:sz w:val="22"/>
-          <w:szCs w:val="22"/>
-        </w:rPr>
-      </w:pPr>
-      <w:r>
-        <w:rPr>
-          <w:rFonts w:ascii="Times New Roman" w:hAnsi="Times New Roman" w:eastAsia="宋体" w:cs="Times New Roman"/>
-          <w:sz w:val="22"/>
-          <w:szCs w:val="22"/>
-        </w:rPr>
-        <w:t xml:space="preserve">Outstanding Graduates Award of UESTC </w:t>
-      </w:r>
-      <w:r>
-        <w:rPr>
-          <w:rFonts w:hint="default" w:ascii="Times New Roman" w:hAnsi="Times New Roman" w:eastAsia="宋体" w:cs="Times New Roman"/>
-          <w:sz w:val="22"/>
-          <w:szCs w:val="22"/>
-          <w:lang w:val="en-US"/>
-        </w:rPr>
-        <w:t xml:space="preserve">  </w:t>
-      </w:r>
-      <w:r>
-        <w:rPr>
-          <w:rFonts w:ascii="Times New Roman" w:hAnsi="Times New Roman" w:eastAsia="宋体" w:cs="Times New Roman"/>
-          <w:sz w:val="22"/>
-          <w:szCs w:val="22"/>
-        </w:rPr>
-        <w:t xml:space="preserve">                                                                                                                </w:t>
-      </w:r>
-      <w:r>
-        <w:rPr>
-          <w:rFonts w:hint="default" w:ascii="Times New Roman" w:hAnsi="Times New Roman" w:eastAsia="宋体" w:cs="Times New Roman"/>
-          <w:sz w:val="22"/>
-          <w:szCs w:val="22"/>
-          <w:lang w:val="en-US"/>
+        <w:t>Foundation models and AI agents for laboratory automation</w:t>
+      </w:r>
+      <w:r>
+        <w:rPr>
+          <w:rFonts w:ascii="Times New Roman" w:hAnsi="Times New Roman" w:cs="Times New Roman"/>
+          <w:sz w:val="24"/>
         </w:rPr>
         <w:t xml:space="preserve"> </w:t>
       </w:r>
-      <w:r>
-        <w:rPr>
-          <w:rFonts w:ascii="Times New Roman" w:hAnsi="Times New Roman" w:eastAsia="宋体" w:cs="Times New Roman"/>
-          <w:sz w:val="22"/>
-          <w:szCs w:val="22"/>
-        </w:rPr>
-        <w:t xml:space="preserve"> 10/2019</w:t>
-      </w:r>
-    </w:p>
-    <w:p>
-      <w:pPr>
-        <w:spacing w:after="200"/>
-        <w:jc w:val="distribute"/>
-        <w:rPr>
-          <w:rFonts w:ascii="Times New Roman" w:hAnsi="Times New Roman" w:eastAsia="宋体" w:cs="Times New Roman"/>
-          <w:sz w:val="22"/>
-          <w:szCs w:val="22"/>
-        </w:rPr>
-      </w:pPr>
-      <w:r>
-        <w:rPr>
-          <w:rFonts w:ascii="Times New Roman" w:hAnsi="Times New Roman" w:eastAsia="宋体" w:cs="Times New Roman"/>
-          <w:sz w:val="22"/>
-          <w:szCs w:val="22"/>
-        </w:rPr>
-        <w:t>"Wu Liang Ye" Enterprise Scholarship (</w:t>
-      </w:r>
-      <w:r>
-        <w:rPr>
-          <w:rFonts w:ascii="Times New Roman" w:hAnsi="Times New Roman" w:eastAsia="宋体" w:cs="Times New Roman"/>
-          <w:b/>
-          <w:bCs/>
-          <w:sz w:val="22"/>
-          <w:szCs w:val="22"/>
-        </w:rPr>
-        <w:t>2/740</w:t>
-      </w:r>
-      <w:r>
-        <w:rPr>
-          <w:rFonts w:ascii="Times New Roman" w:hAnsi="Times New Roman" w:eastAsia="宋体" w:cs="Times New Roman"/>
-          <w:sz w:val="22"/>
-          <w:szCs w:val="22"/>
-        </w:rPr>
-        <w:t xml:space="preserve"> in Software Engineering department)</w:t>
-      </w:r>
-      <w:r>
-        <w:rPr>
-          <w:rFonts w:ascii="Times New Roman" w:hAnsi="Times New Roman" w:eastAsia="宋体" w:cs="Times New Roman"/>
-          <w:sz w:val="22"/>
-          <w:szCs w:val="22"/>
-        </w:rPr>
-        <w:tab/>
-      </w:r>
-      <w:r>
-        <w:rPr>
-          <w:rFonts w:ascii="Times New Roman" w:hAnsi="Times New Roman" w:eastAsia="宋体" w:cs="Times New Roman"/>
-          <w:sz w:val="22"/>
-          <w:szCs w:val="22"/>
-        </w:rPr>
-        <w:t xml:space="preserve">                                </w:t>
-      </w:r>
-      <w:r>
-        <w:rPr>
-          <w:rFonts w:hint="default" w:ascii="Times New Roman" w:hAnsi="Times New Roman" w:eastAsia="宋体" w:cs="Times New Roman"/>
-          <w:sz w:val="22"/>
-          <w:szCs w:val="22"/>
-          <w:lang w:val="en-US"/>
-        </w:rPr>
-        <w:t xml:space="preserve">     </w:t>
-      </w:r>
-      <w:r>
-        <w:rPr>
-          <w:rFonts w:ascii="Times New Roman" w:hAnsi="Times New Roman" w:eastAsia="宋体" w:cs="Times New Roman"/>
-          <w:sz w:val="22"/>
-          <w:szCs w:val="22"/>
-        </w:rPr>
-        <w:t xml:space="preserve"> </w:t>
-      </w:r>
-      <w:r>
-        <w:rPr>
-          <w:rFonts w:hint="default" w:ascii="Times New Roman" w:hAnsi="Times New Roman" w:eastAsia="宋体" w:cs="Times New Roman"/>
-          <w:sz w:val="22"/>
-          <w:szCs w:val="22"/>
-          <w:lang w:val="en-US"/>
-        </w:rPr>
-        <w:t xml:space="preserve"> </w:t>
-      </w:r>
-      <w:r>
-        <w:rPr>
-          <w:rFonts w:ascii="Times New Roman" w:hAnsi="Times New Roman" w:eastAsia="宋体" w:cs="Times New Roman"/>
-          <w:sz w:val="22"/>
-          <w:szCs w:val="22"/>
-        </w:rPr>
-        <w:t>09/2019</w:t>
-      </w:r>
-    </w:p>
-    <w:bookmarkEnd w:id="0"/>
+    </w:p>
     <w:p>
       <w:pPr>
         <w:pBdr>
@@ -1132,6 +604,7 @@
           <w:shd w:val="pct15" w:color="auto" w:fill="FFFFFF"/>
         </w:rPr>
       </w:pPr>
+      <w:bookmarkStart w:id="0" w:name="OLE_LINK7"/>
       <w:r>
         <w:rPr>
           <w:rFonts w:ascii="Times New Roman" w:hAnsi="Times New Roman" w:cs="Times New Roman"/>
@@ -1139,77 +612,356 @@
           <w:sz w:val="24"/>
           <w:shd w:val="pct15" w:color="auto" w:fill="FFFFFF"/>
         </w:rPr>
-        <w:t>TECHNICAL SKILLS</w:t>
-      </w:r>
-    </w:p>
-    <w:p>
-      <w:pPr>
-        <w:rPr>
-          <w:rFonts w:ascii="Times New Roman" w:hAnsi="Times New Roman" w:cs="Times New Roman"/>
-          <w:b/>
-          <w:bCs/>
-        </w:rPr>
-      </w:pPr>
-      <w:r>
-        <w:rPr>
-          <w:rFonts w:ascii="Times New Roman" w:hAnsi="Times New Roman" w:eastAsia="宋体" w:cs="Times New Roman"/>
-          <w:b/>
-          <w:bCs/>
-          <w:sz w:val="22"/>
-          <w:szCs w:val="22"/>
-        </w:rPr>
-        <w:t xml:space="preserve">AI &amp; Data Science: </w:t>
-      </w:r>
-      <w:r>
-        <w:rPr>
-          <w:rFonts w:ascii="Times New Roman" w:hAnsi="Times New Roman" w:eastAsia="宋体" w:cs="Times New Roman"/>
-          <w:sz w:val="22"/>
-          <w:szCs w:val="22"/>
-        </w:rPr>
-        <w:t>Graph Algorithm Library (NetworkX),</w:t>
-      </w:r>
-      <w:r>
-        <w:rPr>
-          <w:rFonts w:ascii="Times New Roman" w:hAnsi="Times New Roman" w:cs="Times New Roman"/>
-        </w:rPr>
-        <w:t xml:space="preserve"> ML/AI/DS Library (</w:t>
-      </w:r>
-      <w:r>
-        <w:rPr>
-          <w:rFonts w:ascii="Times New Roman" w:hAnsi="Times New Roman" w:eastAsia="宋体" w:cs="Times New Roman"/>
-          <w:sz w:val="22"/>
-          <w:szCs w:val="22"/>
-        </w:rPr>
-        <w:t>PyTorch, TensorFlow, NumPy)</w:t>
-      </w:r>
-    </w:p>
-    <w:p>
-      <w:pPr>
-        <w:rPr>
-          <w:rFonts w:ascii="Times New Roman" w:hAnsi="Times New Roman" w:eastAsia="宋体" w:cs="Times New Roman"/>
-          <w:b/>
-          <w:bCs/>
-          <w:sz w:val="22"/>
-          <w:szCs w:val="22"/>
-        </w:rPr>
-      </w:pPr>
-      <w:r>
-        <w:rPr>
-          <w:rFonts w:ascii="Times New Roman" w:hAnsi="Times New Roman" w:eastAsia="宋体" w:cs="Times New Roman"/>
-          <w:b/>
-          <w:bCs/>
-          <w:sz w:val="22"/>
-          <w:szCs w:val="22"/>
-        </w:rPr>
-        <w:t>Systems &amp; Software:</w:t>
-      </w:r>
-      <w:r>
-        <w:rPr>
-          <w:rFonts w:ascii="Times New Roman" w:hAnsi="Times New Roman" w:eastAsia="宋体" w:cs="Times New Roman"/>
-          <w:sz w:val="22"/>
-          <w:szCs w:val="22"/>
-        </w:rPr>
-        <w:t xml:space="preserve"> Python, C/C++, Java, TypeScript, </w:t>
+        <w:t>AWARDS &amp; HONORS</w:t>
+      </w:r>
+    </w:p>
+    <w:p>
+      <w:pPr>
+        <w:jc w:val="distribute"/>
+        <w:rPr>
+          <w:rFonts w:ascii="Times New Roman" w:hAnsi="Times New Roman" w:eastAsia="宋体" w:cs="Times New Roman"/>
+          <w:sz w:val="22"/>
+          <w:szCs w:val="22"/>
+        </w:rPr>
+      </w:pPr>
+      <w:r>
+        <w:rPr>
+          <w:rFonts w:hint="eastAsia" w:ascii="Times New Roman" w:hAnsi="Times New Roman" w:eastAsia="宋体" w:cs="Times New Roman"/>
+          <w:sz w:val="22"/>
+          <w:szCs w:val="22"/>
+        </w:rPr>
+        <w:t>iGEM</w:t>
+      </w:r>
+      <w:r>
+        <w:rPr>
+          <w:rFonts w:ascii="Times New Roman" w:hAnsi="Times New Roman" w:eastAsia="宋体" w:cs="Times New Roman"/>
+          <w:sz w:val="22"/>
+          <w:szCs w:val="22"/>
+        </w:rPr>
+        <w:t xml:space="preserve"> "</w:t>
+      </w:r>
+      <w:r>
+        <w:rPr>
+          <w:rFonts w:ascii="Times New Roman" w:hAnsi="Times New Roman" w:eastAsia="宋体" w:cs="Times New Roman"/>
+          <w:b/>
+          <w:bCs/>
+          <w:sz w:val="22"/>
+          <w:szCs w:val="22"/>
+        </w:rPr>
+        <w:t>Gold medal</w:t>
+      </w:r>
+      <w:r>
+        <w:rPr>
+          <w:rFonts w:ascii="Times New Roman" w:hAnsi="Times New Roman" w:eastAsia="宋体" w:cs="Times New Roman"/>
+          <w:sz w:val="22"/>
+          <w:szCs w:val="22"/>
+        </w:rPr>
+        <w:t xml:space="preserve">" (Student Mentor, wiki: </w:t>
+      </w:r>
+      <w:r>
+        <w:fldChar w:fldCharType="begin"/>
+      </w:r>
+      <w:r>
+        <w:instrText xml:space="preserve"> HYPERLINK "https://2024.igem.wiki/bostonu/" </w:instrText>
+      </w:r>
+      <w:r>
+        <w:fldChar w:fldCharType="separate"/>
+      </w:r>
+      <w:r>
+        <w:rPr>
+          <w:rStyle w:val="7"/>
+          <w:rFonts w:ascii="Times New Roman" w:hAnsi="Times New Roman" w:eastAsia="宋体" w:cs="Times New Roman"/>
+          <w:sz w:val="22"/>
+          <w:szCs w:val="22"/>
+        </w:rPr>
+        <w:t>https://2024.igem.wiki/bostonu/</w:t>
+      </w:r>
+      <w:r>
+        <w:rPr>
+          <w:rStyle w:val="7"/>
+          <w:rFonts w:ascii="Times New Roman" w:hAnsi="Times New Roman" w:eastAsia="宋体" w:cs="Times New Roman"/>
+          <w:sz w:val="22"/>
+          <w:szCs w:val="22"/>
+        </w:rPr>
+        <w:fldChar w:fldCharType="end"/>
+      </w:r>
+      <w:r>
+        <w:rPr>
+          <w:rFonts w:ascii="Times New Roman" w:hAnsi="Times New Roman" w:eastAsia="宋体" w:cs="Times New Roman"/>
+          <w:sz w:val="22"/>
+          <w:szCs w:val="22"/>
+        </w:rPr>
+        <w:t xml:space="preserve">)                                                     </w:t>
+      </w:r>
+      <w:r>
+        <w:rPr>
+          <w:rFonts w:hint="default" w:ascii="Times New Roman" w:hAnsi="Times New Roman" w:eastAsia="宋体" w:cs="Times New Roman"/>
+          <w:sz w:val="22"/>
+          <w:szCs w:val="22"/>
+          <w:lang w:val="en-US"/>
+        </w:rPr>
+        <w:t xml:space="preserve">     </w:t>
+      </w:r>
+      <w:r>
+        <w:rPr>
+          <w:rFonts w:ascii="Times New Roman" w:hAnsi="Times New Roman" w:eastAsia="宋体" w:cs="Times New Roman"/>
+          <w:sz w:val="22"/>
+          <w:szCs w:val="22"/>
+        </w:rPr>
+        <w:t>11/2024</w:t>
+      </w:r>
+    </w:p>
+    <w:p>
+      <w:pPr>
+        <w:jc w:val="distribute"/>
+        <w:rPr>
+          <w:rFonts w:ascii="Times New Roman" w:hAnsi="Times New Roman" w:eastAsia="宋体" w:cs="Times New Roman"/>
+          <w:bCs/>
+          <w:sz w:val="22"/>
+          <w:szCs w:val="22"/>
+        </w:rPr>
+      </w:pPr>
+      <w:r>
+        <w:rPr>
+          <w:rFonts w:ascii="Times New Roman" w:hAnsi="Times New Roman" w:eastAsia="宋体" w:cs="Times New Roman"/>
+          <w:bCs/>
+          <w:sz w:val="22"/>
+          <w:szCs w:val="22"/>
+        </w:rPr>
+        <w:t>China Youth Science and Technology Innovation Award</w:t>
+      </w:r>
+      <w:r>
+        <w:rPr>
+          <w:rFonts w:hint="eastAsia" w:ascii="Times New Roman" w:hAnsi="Times New Roman" w:eastAsia="宋体" w:cs="Times New Roman"/>
+          <w:bCs/>
+          <w:sz w:val="22"/>
+          <w:szCs w:val="22"/>
+        </w:rPr>
+        <w:t xml:space="preserve"> (</w:t>
+      </w:r>
+      <w:r>
+        <w:rPr>
+          <w:rFonts w:ascii="Times New Roman" w:hAnsi="Times New Roman" w:eastAsia="宋体" w:cs="Times New Roman"/>
+          <w:bCs/>
+          <w:sz w:val="22"/>
+          <w:szCs w:val="22"/>
+        </w:rPr>
+        <w:t>Nominated by UESTC</w:t>
+      </w:r>
+      <w:r>
+        <w:rPr>
+          <w:rFonts w:hint="eastAsia" w:ascii="Times New Roman" w:hAnsi="Times New Roman" w:eastAsia="宋体" w:cs="Times New Roman"/>
+          <w:bCs/>
+          <w:sz w:val="22"/>
+          <w:szCs w:val="22"/>
+        </w:rPr>
+        <w:t xml:space="preserve">)                                                   </w:t>
+      </w:r>
+      <w:r>
+        <w:rPr>
+          <w:rFonts w:ascii="Times New Roman" w:hAnsi="Times New Roman" w:eastAsia="宋体" w:cs="Times New Roman"/>
+          <w:bCs/>
+          <w:sz w:val="22"/>
+          <w:szCs w:val="22"/>
+        </w:rPr>
+        <w:t xml:space="preserve">  </w:t>
+      </w:r>
+      <w:r>
+        <w:rPr>
+          <w:rFonts w:hint="eastAsia" w:ascii="Times New Roman" w:hAnsi="Times New Roman" w:eastAsia="宋体" w:cs="Times New Roman"/>
+          <w:bCs/>
+          <w:sz w:val="22"/>
+          <w:szCs w:val="22"/>
+        </w:rPr>
+        <w:t>05</w:t>
+      </w:r>
+      <w:r>
+        <w:rPr>
+          <w:rFonts w:ascii="Times New Roman" w:hAnsi="Times New Roman" w:eastAsia="宋体" w:cs="Times New Roman"/>
+          <w:bCs/>
+          <w:sz w:val="22"/>
+          <w:szCs w:val="22"/>
+        </w:rPr>
+        <w:t>/</w:t>
+      </w:r>
+      <w:r>
+        <w:rPr>
+          <w:rFonts w:hint="eastAsia" w:ascii="Times New Roman" w:hAnsi="Times New Roman" w:eastAsia="宋体" w:cs="Times New Roman"/>
+          <w:bCs/>
+          <w:sz w:val="22"/>
+          <w:szCs w:val="22"/>
+        </w:rPr>
+        <w:t>2020</w:t>
+      </w:r>
+    </w:p>
+    <w:p>
+      <w:pPr>
+        <w:jc w:val="distribute"/>
+        <w:rPr>
+          <w:rFonts w:ascii="Times New Roman" w:hAnsi="Times New Roman" w:eastAsia="宋体" w:cs="Times New Roman"/>
+          <w:sz w:val="22"/>
+          <w:szCs w:val="22"/>
+        </w:rPr>
+      </w:pPr>
+      <w:r>
+        <w:rPr>
+          <w:rFonts w:ascii="Times New Roman" w:hAnsi="Times New Roman" w:eastAsia="宋体" w:cs="Times New Roman"/>
+          <w:b/>
+          <w:bCs/>
+          <w:sz w:val="22"/>
+          <w:szCs w:val="22"/>
+        </w:rPr>
+        <w:t>Most Outstanding Students of UESTC 2019</w:t>
+      </w:r>
+      <w:r>
+        <w:rPr>
+          <w:rFonts w:ascii="Times New Roman" w:hAnsi="Times New Roman" w:eastAsia="宋体" w:cs="Times New Roman"/>
+          <w:sz w:val="22"/>
+          <w:szCs w:val="22"/>
+        </w:rPr>
+        <w:t xml:space="preserve"> (成电杰出学生, </w:t>
+      </w:r>
+      <w:r>
+        <w:rPr>
+          <w:rFonts w:ascii="Times New Roman" w:hAnsi="Times New Roman" w:eastAsia="宋体" w:cs="Times New Roman"/>
+          <w:b/>
+          <w:bCs/>
+          <w:sz w:val="22"/>
+          <w:szCs w:val="22"/>
+        </w:rPr>
+        <w:t>10/5000</w:t>
+      </w:r>
+      <w:r>
+        <w:rPr>
+          <w:rFonts w:ascii="Times New Roman" w:hAnsi="Times New Roman" w:eastAsia="宋体" w:cs="Times New Roman"/>
+          <w:sz w:val="22"/>
+          <w:szCs w:val="22"/>
+        </w:rPr>
+        <w:t xml:space="preserve"> in UESTC, </w:t>
+      </w:r>
+      <w:r>
+        <w:rPr>
+          <w:rFonts w:ascii="Times New Roman" w:hAnsi="Times New Roman" w:eastAsia="宋体" w:cs="Times New Roman"/>
+          <w:b/>
+          <w:bCs/>
+          <w:sz w:val="22"/>
+          <w:szCs w:val="22"/>
+        </w:rPr>
+        <w:t>1/740</w:t>
+      </w:r>
+      <w:r>
+        <w:rPr>
+          <w:rFonts w:ascii="Times New Roman" w:hAnsi="Times New Roman" w:eastAsia="宋体" w:cs="Times New Roman"/>
+          <w:sz w:val="22"/>
+          <w:szCs w:val="22"/>
+        </w:rPr>
+        <w:t xml:space="preserve"> in department)         </w:t>
+      </w:r>
+      <w:r>
+        <w:rPr>
+          <w:rFonts w:hint="default" w:ascii="Times New Roman" w:hAnsi="Times New Roman" w:eastAsia="宋体" w:cs="Times New Roman"/>
+          <w:sz w:val="22"/>
+          <w:szCs w:val="22"/>
+          <w:lang w:val="en-US"/>
+        </w:rPr>
+        <w:t xml:space="preserve">   </w:t>
+      </w:r>
+      <w:r>
+        <w:rPr>
+          <w:rFonts w:ascii="Times New Roman" w:hAnsi="Times New Roman" w:eastAsia="宋体" w:cs="Times New Roman"/>
+          <w:sz w:val="22"/>
+          <w:szCs w:val="22"/>
+        </w:rPr>
+        <w:t xml:space="preserve"> 12/2019</w:t>
+      </w:r>
+    </w:p>
+    <w:p>
+      <w:pPr>
+        <w:jc w:val="distribute"/>
+        <w:rPr>
+          <w:rFonts w:ascii="Times New Roman" w:hAnsi="Times New Roman" w:eastAsia="宋体" w:cs="Times New Roman"/>
+          <w:sz w:val="22"/>
+          <w:szCs w:val="22"/>
+        </w:rPr>
+      </w:pPr>
+      <w:r>
+        <w:rPr>
+          <w:rFonts w:ascii="Times New Roman" w:hAnsi="Times New Roman" w:eastAsia="宋体" w:cs="Times New Roman"/>
+          <w:sz w:val="22"/>
+          <w:szCs w:val="22"/>
+        </w:rPr>
+        <w:t>iGEM "</w:t>
+      </w:r>
+      <w:r>
+        <w:rPr>
+          <w:rFonts w:ascii="Times New Roman" w:hAnsi="Times New Roman" w:eastAsia="宋体" w:cs="Times New Roman"/>
+          <w:b/>
+          <w:bCs/>
+          <w:sz w:val="22"/>
+          <w:szCs w:val="22"/>
+        </w:rPr>
+        <w:t>Gold medal</w:t>
+      </w:r>
+      <w:r>
+        <w:rPr>
+          <w:rFonts w:ascii="Times New Roman" w:hAnsi="Times New Roman" w:eastAsia="宋体" w:cs="Times New Roman"/>
+          <w:sz w:val="22"/>
+          <w:szCs w:val="22"/>
+        </w:rPr>
+        <w:t>" and "</w:t>
+      </w:r>
+      <w:r>
+        <w:rPr>
+          <w:rFonts w:ascii="Times New Roman" w:hAnsi="Times New Roman" w:eastAsia="宋体" w:cs="Times New Roman"/>
+          <w:b/>
+          <w:bCs/>
+          <w:sz w:val="22"/>
+          <w:szCs w:val="22"/>
+        </w:rPr>
+        <w:t>Best Software Project</w:t>
+      </w:r>
+      <w:r>
+        <w:rPr>
+          <w:rFonts w:ascii="Times New Roman" w:hAnsi="Times New Roman" w:eastAsia="宋体" w:cs="Times New Roman"/>
+          <w:sz w:val="22"/>
+          <w:szCs w:val="22"/>
+        </w:rPr>
+        <w:t xml:space="preserve">" (wiki: </w:t>
+      </w:r>
+      <w:r>
+        <w:fldChar w:fldCharType="begin"/>
+      </w:r>
+      <w:r>
+        <w:instrText xml:space="preserve"> HYPERLINK "https://2019.igem.org/Team:UESTC-Software" </w:instrText>
+      </w:r>
+      <w:r>
+        <w:fldChar w:fldCharType="separate"/>
+      </w:r>
+      <w:r>
+        <w:rPr>
+          <w:rStyle w:val="7"/>
+          <w:rFonts w:ascii="Times New Roman" w:hAnsi="Times New Roman" w:eastAsia="宋体" w:cs="Times New Roman"/>
+          <w:sz w:val="22"/>
+          <w:szCs w:val="22"/>
+        </w:rPr>
+        <w:t>https://2019.igem.org/Team:UESTC-Software</w:t>
+      </w:r>
+      <w:r>
+        <w:rPr>
+          <w:rStyle w:val="7"/>
+          <w:rFonts w:ascii="Times New Roman" w:hAnsi="Times New Roman" w:eastAsia="宋体" w:cs="Times New Roman"/>
+          <w:sz w:val="22"/>
+          <w:szCs w:val="22"/>
+        </w:rPr>
+        <w:fldChar w:fldCharType="end"/>
+      </w:r>
+      <w:r>
+        <w:rPr>
+          <w:rFonts w:ascii="Times New Roman" w:hAnsi="Times New Roman" w:eastAsia="宋体" w:cs="Times New Roman"/>
+          <w:sz w:val="22"/>
+          <w:szCs w:val="22"/>
+        </w:rPr>
+        <w:t>)</w:t>
       </w:r>
       <w:r>
         <w:rPr>
@@ -1221,95 +973,172 @@
       </w:r>
       <w:r>
         <w:rPr>
-          <w:rFonts w:hint="eastAsia" w:ascii="Times New Roman" w:hAnsi="Times New Roman" w:eastAsia="宋体" w:cs="Times New Roman"/>
-          <w:sz w:val="22"/>
-          <w:szCs w:val="22"/>
-        </w:rPr>
-        <w:t>Java</w:t>
-      </w:r>
-      <w:r>
-        <w:rPr>
-          <w:rFonts w:ascii="Times New Roman" w:hAnsi="Times New Roman" w:eastAsia="宋体" w:cs="Times New Roman"/>
-          <w:sz w:val="22"/>
-          <w:szCs w:val="22"/>
-        </w:rPr>
-        <w:t>Script, HTML, Linux Shell, LaTeX</w:t>
-      </w:r>
-    </w:p>
-    <w:p>
-      <w:pPr>
-        <w:rPr>
-          <w:b/>
-          <w:bCs/>
-        </w:rPr>
-      </w:pPr>
-      <w:r>
-        <w:rPr>
-          <w:rFonts w:ascii="Times New Roman" w:hAnsi="Times New Roman" w:eastAsia="宋体" w:cs="Times New Roman"/>
-          <w:b/>
-          <w:bCs/>
-          <w:sz w:val="22"/>
-          <w:szCs w:val="22"/>
-        </w:rPr>
-        <w:t xml:space="preserve">Biological &amp; Microfluidic </w:t>
-      </w:r>
-      <w:r>
-        <w:rPr>
-          <w:rFonts w:hint="eastAsia" w:ascii="Times New Roman" w:hAnsi="Times New Roman" w:eastAsia="宋体" w:cs="Times New Roman"/>
-          <w:b/>
-          <w:bCs/>
-          <w:sz w:val="22"/>
-          <w:szCs w:val="22"/>
-        </w:rPr>
-        <w:t>Skills</w:t>
-      </w:r>
-      <w:r>
-        <w:rPr>
-          <w:rFonts w:ascii="Times New Roman" w:hAnsi="Times New Roman" w:eastAsia="宋体" w:cs="Times New Roman"/>
-          <w:b/>
-          <w:bCs/>
-          <w:sz w:val="22"/>
-          <w:szCs w:val="22"/>
-        </w:rPr>
-        <w:t>:</w:t>
-      </w:r>
-      <w:r>
-        <w:rPr>
-          <w:rFonts w:ascii="Times New Roman" w:hAnsi="Times New Roman" w:eastAsia="宋体" w:cs="Times New Roman"/>
-          <w:sz w:val="22"/>
-          <w:szCs w:val="22"/>
-        </w:rPr>
-        <w:t xml:space="preserve"> CNC Milling, Laser Cutting, Benchmark Collection and Evaluation</w:t>
+          <w:rFonts w:ascii="Times New Roman" w:hAnsi="Times New Roman" w:eastAsia="宋体" w:cs="Times New Roman"/>
+          <w:sz w:val="22"/>
+          <w:szCs w:val="22"/>
+        </w:rPr>
+        <w:t xml:space="preserve">       </w:t>
+      </w:r>
+      <w:r>
+        <w:rPr>
+          <w:rFonts w:hint="default" w:ascii="Times New Roman" w:hAnsi="Times New Roman" w:eastAsia="宋体" w:cs="Times New Roman"/>
+          <w:sz w:val="22"/>
+          <w:szCs w:val="22"/>
+          <w:lang w:val="en-US"/>
+        </w:rPr>
+        <w:t xml:space="preserve">      </w:t>
+      </w:r>
+      <w:r>
+        <w:rPr>
+          <w:rFonts w:ascii="Times New Roman" w:hAnsi="Times New Roman" w:eastAsia="宋体" w:cs="Times New Roman"/>
+          <w:sz w:val="22"/>
+          <w:szCs w:val="22"/>
+        </w:rPr>
+        <w:t>11/2019</w:t>
+      </w:r>
+    </w:p>
+    <w:p>
+      <w:pPr>
+        <w:jc w:val="distribute"/>
+        <w:rPr>
+          <w:rFonts w:ascii="Times New Roman" w:hAnsi="Times New Roman" w:eastAsia="宋体" w:cs="Times New Roman"/>
+          <w:i/>
+          <w:iCs/>
+          <w:sz w:val="22"/>
+          <w:szCs w:val="22"/>
+        </w:rPr>
+      </w:pPr>
+      <w:r>
+        <w:rPr>
+          <w:rFonts w:ascii="Times New Roman" w:hAnsi="Times New Roman" w:eastAsia="宋体" w:cs="Times New Roman"/>
+          <w:sz w:val="22"/>
+          <w:szCs w:val="22"/>
+        </w:rPr>
+        <w:t xml:space="preserve">Outstanding Graduates Award of UESTC </w:t>
+      </w:r>
+      <w:r>
+        <w:rPr>
+          <w:rFonts w:hint="default" w:ascii="Times New Roman" w:hAnsi="Times New Roman" w:eastAsia="宋体" w:cs="Times New Roman"/>
+          <w:sz w:val="22"/>
+          <w:szCs w:val="22"/>
+          <w:lang w:val="en-US"/>
+        </w:rPr>
+        <w:t xml:space="preserve">  </w:t>
+      </w:r>
+      <w:r>
+        <w:rPr>
+          <w:rFonts w:ascii="Times New Roman" w:hAnsi="Times New Roman" w:eastAsia="宋体" w:cs="Times New Roman"/>
+          <w:sz w:val="22"/>
+          <w:szCs w:val="22"/>
+        </w:rPr>
+        <w:t xml:space="preserve">                                                                                                                </w:t>
+      </w:r>
+      <w:r>
+        <w:rPr>
+          <w:rFonts w:hint="default" w:ascii="Times New Roman" w:hAnsi="Times New Roman" w:eastAsia="宋体" w:cs="Times New Roman"/>
+          <w:sz w:val="22"/>
+          <w:szCs w:val="22"/>
+          <w:lang w:val="en-US"/>
+        </w:rPr>
+        <w:t xml:space="preserve"> </w:t>
+      </w:r>
+      <w:r>
+        <w:rPr>
+          <w:rFonts w:ascii="Times New Roman" w:hAnsi="Times New Roman" w:eastAsia="宋体" w:cs="Times New Roman"/>
+          <w:sz w:val="22"/>
+          <w:szCs w:val="22"/>
+        </w:rPr>
+        <w:t xml:space="preserve"> 10/2019</w:t>
       </w:r>
     </w:p>
     <w:p>
       <w:pPr>
         <w:spacing w:after="200"/>
-        <w:rPr>
-          <w:rFonts w:ascii="Times New Roman" w:hAnsi="Times New Roman" w:eastAsia="宋体" w:cs="Times New Roman"/>
-          <w:sz w:val="22"/>
-          <w:szCs w:val="22"/>
-        </w:rPr>
-      </w:pPr>
-      <w:r>
-        <w:rPr>
-          <w:rFonts w:ascii="Times New Roman" w:hAnsi="Times New Roman" w:eastAsia="宋体" w:cs="Times New Roman"/>
-          <w:b/>
-          <w:bCs/>
-          <w:sz w:val="22"/>
-          <w:szCs w:val="22"/>
-        </w:rPr>
-        <w:t>CAD Tools:</w:t>
-      </w:r>
-      <w:r>
-        <w:rPr>
-          <w:rFonts w:ascii="Times New Roman" w:hAnsi="Times New Roman" w:eastAsia="宋体" w:cs="Times New Roman"/>
-          <w:sz w:val="22"/>
-          <w:szCs w:val="22"/>
-        </w:rPr>
-        <w:t xml:space="preserve"> Fusion 360, Microfluidic Devices Manual Design</w:t>
-      </w:r>
-    </w:p>
+        <w:jc w:val="distribute"/>
+        <w:rPr>
+          <w:rFonts w:ascii="Times New Roman" w:hAnsi="Times New Roman" w:eastAsia="宋体" w:cs="Times New Roman"/>
+          <w:sz w:val="22"/>
+          <w:szCs w:val="22"/>
+        </w:rPr>
+      </w:pPr>
+      <w:r>
+        <w:rPr>
+          <w:rFonts w:ascii="Times New Roman" w:hAnsi="Times New Roman" w:eastAsia="宋体" w:cs="Times New Roman"/>
+          <w:sz w:val="22"/>
+          <w:szCs w:val="22"/>
+        </w:rPr>
+        <w:t>"Wu Liang Ye" Enterprise Scholarship (</w:t>
+      </w:r>
+      <w:r>
+        <w:rPr>
+          <w:rFonts w:ascii="Times New Roman" w:hAnsi="Times New Roman" w:eastAsia="宋体" w:cs="Times New Roman"/>
+          <w:b/>
+          <w:bCs/>
+          <w:sz w:val="22"/>
+          <w:szCs w:val="22"/>
+        </w:rPr>
+        <w:t>2/740</w:t>
+      </w:r>
+      <w:r>
+        <w:rPr>
+          <w:rFonts w:ascii="Times New Roman" w:hAnsi="Times New Roman" w:eastAsia="宋体" w:cs="Times New Roman"/>
+          <w:sz w:val="22"/>
+          <w:szCs w:val="22"/>
+        </w:rPr>
+        <w:t xml:space="preserve"> in Software Engineering department)</w:t>
+      </w:r>
+      <w:r>
+        <w:rPr>
+          <w:rFonts w:ascii="Times New Roman" w:hAnsi="Times New Roman" w:eastAsia="宋体" w:cs="Times New Roman"/>
+          <w:sz w:val="22"/>
+          <w:szCs w:val="22"/>
+        </w:rPr>
+        <w:tab/>
+      </w:r>
+      <w:r>
+        <w:rPr>
+          <w:rFonts w:ascii="Times New Roman" w:hAnsi="Times New Roman" w:eastAsia="宋体" w:cs="Times New Roman"/>
+          <w:sz w:val="22"/>
+          <w:szCs w:val="22"/>
+        </w:rPr>
+        <w:t xml:space="preserve">                                </w:t>
+      </w:r>
+      <w:r>
+        <w:rPr>
+          <w:rFonts w:hint="default" w:ascii="Times New Roman" w:hAnsi="Times New Roman" w:eastAsia="宋体" w:cs="Times New Roman"/>
+          <w:sz w:val="22"/>
+          <w:szCs w:val="22"/>
+          <w:lang w:val="en-US"/>
+        </w:rPr>
+        <w:t xml:space="preserve">     </w:t>
+      </w:r>
+      <w:r>
+        <w:rPr>
+          <w:rFonts w:ascii="Times New Roman" w:hAnsi="Times New Roman" w:eastAsia="宋体" w:cs="Times New Roman"/>
+          <w:sz w:val="22"/>
+          <w:szCs w:val="22"/>
+        </w:rPr>
+        <w:t xml:space="preserve"> </w:t>
+      </w:r>
+      <w:r>
+        <w:rPr>
+          <w:rFonts w:hint="default" w:ascii="Times New Roman" w:hAnsi="Times New Roman" w:eastAsia="宋体" w:cs="Times New Roman"/>
+          <w:sz w:val="22"/>
+          <w:szCs w:val="22"/>
+          <w:lang w:val="en-US"/>
+        </w:rPr>
+        <w:t xml:space="preserve"> </w:t>
+      </w:r>
+      <w:r>
+        <w:rPr>
+          <w:rFonts w:ascii="Times New Roman" w:hAnsi="Times New Roman" w:eastAsia="宋体" w:cs="Times New Roman"/>
+          <w:sz w:val="22"/>
+          <w:szCs w:val="22"/>
+        </w:rPr>
+        <w:t>09/2019</w:t>
+      </w:r>
+    </w:p>
+    <w:bookmarkEnd w:id="0"/>
     <w:p>
       <w:pPr>
         <w:pBdr>
@@ -1330,6 +1159,230 @@
           <w:sz w:val="24"/>
           <w:shd w:val="pct15" w:color="auto" w:fill="FFFFFF"/>
         </w:rPr>
+        <w:t>TECHNICAL SKILLS</w:t>
+      </w:r>
+    </w:p>
+    <w:p>
+      <w:pPr>
+        <w:rPr>
+          <w:rFonts w:hint="default" w:ascii="Times New Roman" w:hAnsi="Times New Roman" w:eastAsia="宋体" w:cs="Times New Roman"/>
+          <w:sz w:val="22"/>
+          <w:szCs w:val="22"/>
+          <w:lang w:val="en-US"/>
+        </w:rPr>
+      </w:pPr>
+      <w:r>
+        <w:rPr>
+          <w:rFonts w:hint="eastAsia" w:ascii="Times New Roman" w:hAnsi="Times New Roman" w:eastAsia="宋体" w:cs="Times New Roman"/>
+          <w:b/>
+          <w:bCs/>
+          <w:sz w:val="22"/>
+          <w:szCs w:val="22"/>
+        </w:rPr>
+        <w:t>Core Expertise</w:t>
+      </w:r>
+      <w:r>
+        <w:rPr>
+          <w:rFonts w:hint="default" w:ascii="Times New Roman" w:hAnsi="Times New Roman" w:eastAsia="宋体" w:cs="Times New Roman"/>
+          <w:b/>
+          <w:bCs/>
+          <w:sz w:val="22"/>
+          <w:szCs w:val="22"/>
+          <w:lang w:val="en-US"/>
+        </w:rPr>
+        <w:t xml:space="preserve">: </w:t>
+      </w:r>
+      <w:r>
+        <w:rPr>
+          <w:rFonts w:hint="default" w:ascii="Times New Roman" w:hAnsi="Times New Roman" w:eastAsia="宋体" w:cs="Times New Roman"/>
+          <w:sz w:val="22"/>
+          <w:szCs w:val="22"/>
+          <w:lang w:val="en-US"/>
+        </w:rPr>
+        <w:t>Algorithm Design, Graph Algorithms, Constraint Formalization, Scientific Software Engineering, Formal Verification, Optimization, Compiler &amp; DSL Design, AI-assisted Scientific Computing</w:t>
+      </w:r>
+    </w:p>
+    <w:p>
+      <w:pPr>
+        <w:rPr>
+          <w:rFonts w:ascii="Times New Roman" w:hAnsi="Times New Roman" w:cs="Times New Roman"/>
+          <w:b/>
+          <w:bCs/>
+        </w:rPr>
+      </w:pPr>
+      <w:r>
+        <w:rPr>
+          <w:rFonts w:ascii="Times New Roman" w:hAnsi="Times New Roman" w:eastAsia="宋体" w:cs="Times New Roman"/>
+          <w:b/>
+          <w:bCs/>
+          <w:sz w:val="22"/>
+          <w:szCs w:val="22"/>
+        </w:rPr>
+        <w:t xml:space="preserve">AI &amp; Data Science: </w:t>
+      </w:r>
+      <w:r>
+        <w:rPr>
+          <w:rFonts w:ascii="Times New Roman" w:hAnsi="Times New Roman" w:eastAsia="宋体" w:cs="Times New Roman"/>
+          <w:sz w:val="22"/>
+          <w:szCs w:val="22"/>
+        </w:rPr>
+        <w:t>Graph Algorithm Library (NetworkX),</w:t>
+      </w:r>
+      <w:r>
+        <w:rPr>
+          <w:rFonts w:ascii="Times New Roman" w:hAnsi="Times New Roman" w:cs="Times New Roman"/>
+        </w:rPr>
+        <w:t xml:space="preserve"> ML/AI/DS Library (</w:t>
+      </w:r>
+      <w:r>
+        <w:rPr>
+          <w:rFonts w:ascii="Times New Roman" w:hAnsi="Times New Roman" w:eastAsia="宋体" w:cs="Times New Roman"/>
+          <w:sz w:val="22"/>
+          <w:szCs w:val="22"/>
+        </w:rPr>
+        <w:t>PyTorch, TensorFlow, NumPy)</w:t>
+      </w:r>
+    </w:p>
+    <w:p>
+      <w:pPr>
+        <w:rPr>
+          <w:rFonts w:ascii="Times New Roman" w:hAnsi="Times New Roman" w:eastAsia="宋体" w:cs="Times New Roman"/>
+          <w:b/>
+          <w:bCs/>
+          <w:sz w:val="22"/>
+          <w:szCs w:val="22"/>
+        </w:rPr>
+      </w:pPr>
+      <w:r>
+        <w:rPr>
+          <w:rFonts w:ascii="Times New Roman" w:hAnsi="Times New Roman" w:eastAsia="宋体" w:cs="Times New Roman"/>
+          <w:b/>
+          <w:bCs/>
+          <w:sz w:val="22"/>
+          <w:szCs w:val="22"/>
+        </w:rPr>
+        <w:t>Systems &amp; Software:</w:t>
+      </w:r>
+      <w:r>
+        <w:rPr>
+          <w:rFonts w:ascii="Times New Roman" w:hAnsi="Times New Roman" w:eastAsia="宋体" w:cs="Times New Roman"/>
+          <w:sz w:val="22"/>
+          <w:szCs w:val="22"/>
+        </w:rPr>
+        <w:t xml:space="preserve"> Python, C/C++, Java, TypeScript, </w:t>
+      </w:r>
+      <w:r>
+        <w:rPr>
+          <w:rFonts w:ascii="Times New Roman" w:hAnsi="Times New Roman" w:eastAsia="宋体" w:cs="Times New Roman"/>
+          <w:sz w:val="22"/>
+          <w:szCs w:val="22"/>
+        </w:rPr>
+        <w:tab/>
+      </w:r>
+      <w:r>
+        <w:rPr>
+          <w:rFonts w:ascii="Times New Roman" w:hAnsi="Times New Roman" w:eastAsia="宋体" w:cs="Times New Roman"/>
+          <w:sz w:val="22"/>
+          <w:szCs w:val="22"/>
+        </w:rPr>
+        <w:t>HTML, Linux Shell, LaTeX</w:t>
+      </w:r>
+    </w:p>
+    <w:p>
+      <w:pPr>
+        <w:rPr>
+          <w:rFonts w:ascii="Times New Roman" w:hAnsi="Times New Roman" w:eastAsia="宋体" w:cs="Times New Roman"/>
+          <w:sz w:val="22"/>
+          <w:szCs w:val="22"/>
+        </w:rPr>
+      </w:pPr>
+      <w:r>
+        <w:rPr>
+          <w:rFonts w:ascii="Times New Roman" w:hAnsi="Times New Roman" w:eastAsia="宋体" w:cs="Times New Roman"/>
+          <w:b/>
+          <w:bCs/>
+          <w:sz w:val="22"/>
+          <w:szCs w:val="22"/>
+        </w:rPr>
+        <w:t xml:space="preserve">Biological &amp; Microfluidic </w:t>
+      </w:r>
+      <w:r>
+        <w:rPr>
+          <w:rFonts w:hint="eastAsia" w:ascii="Times New Roman" w:hAnsi="Times New Roman" w:eastAsia="宋体" w:cs="Times New Roman"/>
+          <w:b/>
+          <w:bCs/>
+          <w:sz w:val="22"/>
+          <w:szCs w:val="22"/>
+        </w:rPr>
+        <w:t>Skills</w:t>
+      </w:r>
+      <w:r>
+        <w:rPr>
+          <w:rFonts w:ascii="Times New Roman" w:hAnsi="Times New Roman" w:eastAsia="宋体" w:cs="Times New Roman"/>
+          <w:b/>
+          <w:bCs/>
+          <w:sz w:val="22"/>
+          <w:szCs w:val="22"/>
+        </w:rPr>
+        <w:t>:</w:t>
+      </w:r>
+      <w:r>
+        <w:rPr>
+          <w:rFonts w:ascii="Times New Roman" w:hAnsi="Times New Roman" w:eastAsia="宋体" w:cs="Times New Roman"/>
+          <w:sz w:val="22"/>
+          <w:szCs w:val="22"/>
+        </w:rPr>
+        <w:t xml:space="preserve"> CNC Milling, Laser Cutting, Benchmark Collection and Evaluation</w:t>
+      </w:r>
+    </w:p>
+    <w:p>
+      <w:pPr>
+        <w:spacing w:after="200"/>
+        <w:rPr>
+          <w:rFonts w:ascii="Times New Roman" w:hAnsi="Times New Roman" w:eastAsia="宋体" w:cs="Times New Roman"/>
+          <w:sz w:val="22"/>
+          <w:szCs w:val="22"/>
+        </w:rPr>
+      </w:pPr>
+      <w:r>
+        <w:rPr>
+          <w:rFonts w:ascii="Times New Roman" w:hAnsi="Times New Roman" w:eastAsia="宋体" w:cs="Times New Roman"/>
+          <w:b/>
+          <w:bCs/>
+          <w:sz w:val="22"/>
+          <w:szCs w:val="22"/>
+        </w:rPr>
+        <w:t>CAD Tools:</w:t>
+      </w:r>
+      <w:r>
+        <w:rPr>
+          <w:rFonts w:ascii="Times New Roman" w:hAnsi="Times New Roman" w:eastAsia="宋体" w:cs="Times New Roman"/>
+          <w:sz w:val="22"/>
+          <w:szCs w:val="22"/>
+        </w:rPr>
+        <w:t xml:space="preserve"> Fusion 360, Microfluidic Devices Manual Design</w:t>
+      </w:r>
+    </w:p>
+    <w:p>
+      <w:pPr>
+        <w:pBdr>
+          <w:bottom w:val="single" w:color="auto" w:sz="4" w:space="0"/>
+        </w:pBdr>
+        <w:spacing w:after="100"/>
+        <w:rPr>
+          <w:rFonts w:ascii="Times New Roman" w:hAnsi="Times New Roman" w:cs="Times New Roman"/>
+          <w:b/>
+          <w:sz w:val="24"/>
+          <w:shd w:val="pct15" w:color="auto" w:fill="FFFFFF"/>
+        </w:rPr>
+      </w:pPr>
+      <w:r>
+        <w:rPr>
+          <w:rFonts w:ascii="Times New Roman" w:hAnsi="Times New Roman" w:cs="Times New Roman"/>
+          <w:b/>
+          <w:sz w:val="24"/>
+          <w:shd w:val="pct15" w:color="auto" w:fill="FFFFFF"/>
+        </w:rPr>
         <w:t>RESEARCH EXPERIENCE</w:t>
       </w:r>
     </w:p>
@@ -1360,7 +1413,24 @@
           <w:sz w:val="22"/>
           <w:szCs w:val="22"/>
         </w:rPr>
-        <w:t>| Boston University, CIDAR lab                                                           Boston, MA | 09/2020-Present</w:t>
+        <w:t xml:space="preserve">| Boston University, CIDAR lab                                                           </w:t>
+      </w:r>
+      <w:r>
+        <w:rPr>
+          <w:rFonts w:hint="eastAsia" w:ascii="Times New Roman" w:hAnsi="Times New Roman" w:eastAsia="宋体" w:cs="Times New Roman"/>
+          <w:sz w:val="22"/>
+          <w:szCs w:val="22"/>
+          <w:lang w:val="en-US" w:eastAsia="zh-CN"/>
+        </w:rPr>
+        <w:t xml:space="preserve">    </w:t>
+      </w:r>
+      <w:r>
+        <w:rPr>
+          <w:rFonts w:ascii="Times New Roman" w:hAnsi="Times New Roman" w:eastAsia="宋体" w:cs="Times New Roman"/>
+          <w:sz w:val="22"/>
+          <w:szCs w:val="22"/>
+        </w:rPr>
+        <w:t>Boston, MA | 09/2020-Present</w:t>
       </w:r>
     </w:p>
     <w:p>
@@ -1426,69 +1496,69 @@
       <w:pPr>
         <w:pStyle w:val="11"/>
         <w:numPr>
-          <w:ilvl w:val="1"/>
-          <w:numId w:val="1"/>
+          <w:ilvl w:val="0"/>
+          <w:numId w:val="2"/>
         </w:numPr>
         <w:ind w:firstLineChars="0"/>
         <w:rPr>
-          <w:rFonts w:ascii="Times New Roman" w:hAnsi="Times New Roman" w:cs="Times New Roman"/>
-          <w:sz w:val="22"/>
-          <w:szCs w:val="28"/>
-        </w:rPr>
-      </w:pPr>
-      <w:r>
-        <w:rPr>
-          <w:rFonts w:ascii="Times New Roman" w:hAnsi="Times New Roman" w:cs="Times New Roman"/>
-          <w:sz w:val="22"/>
-          <w:szCs w:val="28"/>
-        </w:rPr>
-        <w:t>Developed a full-stack microfluidic design automation system enabling end-to-end synthesis from high-level behavioral specifications to physical layout generation.</w:t>
+          <w:rFonts w:hint="eastAsia" w:ascii="Times New Roman" w:hAnsi="Times New Roman" w:cs="Times New Roman"/>
+          <w:sz w:val="22"/>
+          <w:szCs w:val="28"/>
+        </w:rPr>
+      </w:pPr>
+      <w:r>
+        <w:rPr>
+          <w:rFonts w:hint="eastAsia" w:ascii="Times New Roman" w:hAnsi="Times New Roman" w:cs="Times New Roman"/>
+          <w:sz w:val="22"/>
+          <w:szCs w:val="28"/>
+        </w:rPr>
+        <w:t>Designed a domain-specific programming language (DSL) and compiler enabling AI-assisted biological design.</w:t>
       </w:r>
     </w:p>
     <w:p>
       <w:pPr>
         <w:pStyle w:val="11"/>
         <w:numPr>
-          <w:ilvl w:val="1"/>
-          <w:numId w:val="1"/>
+          <w:ilvl w:val="0"/>
+          <w:numId w:val="2"/>
         </w:numPr>
         <w:ind w:firstLineChars="0"/>
         <w:rPr>
-          <w:rFonts w:ascii="Times New Roman" w:hAnsi="Times New Roman" w:cs="Times New Roman"/>
-          <w:sz w:val="22"/>
-          <w:szCs w:val="28"/>
-        </w:rPr>
-      </w:pPr>
-      <w:r>
-        <w:rPr>
-          <w:rFonts w:ascii="Times New Roman" w:hAnsi="Times New Roman" w:cs="Times New Roman"/>
-          <w:sz w:val="22"/>
-          <w:szCs w:val="28"/>
-        </w:rPr>
-        <w:t>Developed a DSL and compiler that transform behavioral design inputs into structured connectivity graphs, which are further processed by external placement and routing algorithms; the DSL is currently supported by all five major mainstream large language models for assisted program synthesis.</w:t>
+          <w:rFonts w:hint="eastAsia" w:ascii="Times New Roman" w:hAnsi="Times New Roman" w:cs="Times New Roman"/>
+          <w:sz w:val="22"/>
+          <w:szCs w:val="28"/>
+        </w:rPr>
+      </w:pPr>
+      <w:r>
+        <w:rPr>
+          <w:rFonts w:hint="eastAsia" w:ascii="Times New Roman" w:hAnsi="Times New Roman" w:cs="Times New Roman"/>
+          <w:sz w:val="22"/>
+          <w:szCs w:val="28"/>
+        </w:rPr>
+        <w:t>Developed graph-based intermediate representations supporting automated optimization.</w:t>
       </w:r>
     </w:p>
     <w:p>
       <w:pPr>
         <w:pStyle w:val="11"/>
         <w:numPr>
-          <w:ilvl w:val="1"/>
-          <w:numId w:val="1"/>
+          <w:ilvl w:val="0"/>
+          <w:numId w:val="2"/>
         </w:numPr>
         <w:ind w:firstLineChars="0"/>
         <w:rPr>
-          <w:rFonts w:ascii="Times New Roman" w:hAnsi="Times New Roman" w:cs="Times New Roman"/>
-          <w:sz w:val="22"/>
-          <w:szCs w:val="28"/>
-        </w:rPr>
-      </w:pPr>
-      <w:r>
-        <w:rPr>
-          <w:rFonts w:ascii="Times New Roman" w:hAnsi="Times New Roman" w:cs="Times New Roman"/>
-          <w:sz w:val="22"/>
-          <w:szCs w:val="28"/>
-        </w:rPr>
-        <w:t xml:space="preserve">Built a web-based interface tightly integrated into the lab’s existing 3DuF design environment, enabling direct visualization, interactive editing, and manual refinement of synthesized microfluidic designs. </w:t>
+          <w:rFonts w:hint="eastAsia" w:ascii="Times New Roman" w:hAnsi="Times New Roman" w:cs="Times New Roman"/>
+          <w:sz w:val="22"/>
+          <w:szCs w:val="28"/>
+        </w:rPr>
+      </w:pPr>
+      <w:r>
+        <w:rPr>
+          <w:rFonts w:hint="eastAsia" w:ascii="Times New Roman" w:hAnsi="Times New Roman" w:cs="Times New Roman"/>
+          <w:sz w:val="22"/>
+          <w:szCs w:val="28"/>
+        </w:rPr>
+        <w:t xml:space="preserve">Built an extensible software infrastructure for end-to-end scientific design automation. </w:t>
       </w:r>
     </w:p>
     <w:p>
@@ -1552,11 +1622,11 @@
       </w:pPr>
       <w:r>
         <w:rPr>
-          <w:rFonts w:ascii="Times New Roman" w:hAnsi="Times New Roman" w:cs="Times New Roman"/>
-          <w:sz w:val="22"/>
-          <w:szCs w:val="28"/>
-        </w:rPr>
-        <w:t xml:space="preserve">Developed a sub-graph partitioning algorithm enabling implementation of complex computational functions (e.g., cryptographic hashing) in multicellular systems under biological and hardware constraints. </w:t>
+          <w:rFonts w:hint="eastAsia" w:ascii="Times New Roman" w:hAnsi="Times New Roman" w:cs="Times New Roman"/>
+          <w:sz w:val="22"/>
+          <w:szCs w:val="28"/>
+        </w:rPr>
+        <w:t>Developed a constraint-based graph partitioning algorithm for multicellular computation under biological and hardware constraints.</w:t>
       </w:r>
     </w:p>
     <w:p>
@@ -1575,11 +1645,11 @@
       </w:pPr>
       <w:r>
         <w:rPr>
-          <w:rFonts w:ascii="Times New Roman" w:hAnsi="Times New Roman" w:cs="Times New Roman"/>
-          <w:sz w:val="22"/>
-          <w:szCs w:val="28"/>
-        </w:rPr>
-        <w:t>Designed a constraint formalization layer that encodes biological and experimental constraints into computational representations, enabling automated design and optimization in genetic circuit synthesis.</w:t>
+          <w:rFonts w:hint="eastAsia" w:ascii="Times New Roman" w:hAnsi="Times New Roman" w:cs="Times New Roman"/>
+          <w:sz w:val="22"/>
+          <w:szCs w:val="28"/>
+        </w:rPr>
+        <w:t>Formalized biological and experimental constraints into computational representations, enabling automated genetic circuit synthesis and optimization.</w:t>
       </w:r>
     </w:p>
     <w:p>
@@ -1750,8 +1820,44 @@
           <w:sz w:val="22"/>
           <w:szCs w:val="28"/>
         </w:rPr>
-        <w:t>Constructed benchmark datasets and logic-level constraint representations for evaluating and optimizing microfluidic design automation methods.</w:t>
-      </w:r>
+        <w:t xml:space="preserve">Constructed benchmark datasets for </w:t>
+      </w:r>
+      <w:r>
+        <w:rPr>
+          <w:rFonts w:hint="eastAsia" w:ascii="Times New Roman" w:hAnsi="Times New Roman" w:cs="Times New Roman"/>
+          <w:sz w:val="22"/>
+          <w:szCs w:val="28"/>
+          <w:lang w:val="en-US" w:eastAsia="zh-CN"/>
+        </w:rPr>
+        <w:t xml:space="preserve">future standardized </w:t>
+      </w:r>
+      <w:r>
+        <w:rPr>
+          <w:rFonts w:ascii="Times New Roman" w:hAnsi="Times New Roman" w:cs="Times New Roman"/>
+          <w:sz w:val="22"/>
+          <w:szCs w:val="28"/>
+        </w:rPr>
+        <w:t>evaluat</w:t>
+      </w:r>
+      <w:r>
+        <w:rPr>
+          <w:rFonts w:hint="eastAsia" w:ascii="Times New Roman" w:hAnsi="Times New Roman" w:cs="Times New Roman"/>
+          <w:sz w:val="22"/>
+          <w:szCs w:val="28"/>
+          <w:lang w:val="en-US" w:eastAsia="zh-CN"/>
+        </w:rPr>
+        <w:t>ion</w:t>
+      </w:r>
+      <w:r>
+        <w:rPr>
+          <w:rFonts w:ascii="Times New Roman" w:hAnsi="Times New Roman" w:cs="Times New Roman"/>
+          <w:sz w:val="22"/>
+          <w:szCs w:val="28"/>
+        </w:rPr>
+        <w:t>.</w:t>
+      </w:r>
+      <w:bookmarkStart w:id="2" w:name="_GoBack"/>
+      <w:bookmarkEnd w:id="2"/>
     </w:p>
     <w:p>
       <w:pPr>
@@ -1894,7 +2000,24 @@
           <w:sz w:val="22"/>
           <w:szCs w:val="22"/>
         </w:rPr>
-        <w:t>)                   Boston, MA | 05-10/2024</w:t>
+        <w:t xml:space="preserve">)                   </w:t>
+      </w:r>
+      <w:r>
+        <w:rPr>
+          <w:rFonts w:hint="eastAsia" w:ascii="Times New Roman" w:hAnsi="Times New Roman" w:eastAsia="宋体" w:cs="Times New Roman"/>
+          <w:sz w:val="22"/>
+          <w:szCs w:val="22"/>
+          <w:lang w:val="en-US" w:eastAsia="zh-CN"/>
+        </w:rPr>
+        <w:t xml:space="preserve">     </w:t>
+      </w:r>
+      <w:r>
+        <w:rPr>
+          <w:rFonts w:ascii="Times New Roman" w:hAnsi="Times New Roman" w:eastAsia="宋体" w:cs="Times New Roman"/>
+          <w:sz w:val="22"/>
+          <w:szCs w:val="22"/>
+        </w:rPr>
+        <w:t>Boston, MA | 05-10/2024</w:t>
       </w:r>
     </w:p>
     <w:p>
@@ -2015,7 +2138,24 @@
           <w:sz w:val="22"/>
           <w:szCs w:val="22"/>
         </w:rPr>
-        <w:t>)       Chengdu, China | 05-10/2019</w:t>
+        <w:t xml:space="preserve">)       </w:t>
+      </w:r>
+      <w:r>
+        <w:rPr>
+          <w:rFonts w:hint="eastAsia" w:ascii="Times New Roman" w:hAnsi="Times New Roman" w:eastAsia="宋体" w:cs="Times New Roman"/>
+          <w:sz w:val="22"/>
+          <w:szCs w:val="22"/>
+          <w:lang w:val="en-US" w:eastAsia="zh-CN"/>
+        </w:rPr>
+        <w:t xml:space="preserve">  </w:t>
+      </w:r>
+      <w:r>
+        <w:rPr>
+          <w:rFonts w:ascii="Times New Roman" w:hAnsi="Times New Roman" w:eastAsia="宋体" w:cs="Times New Roman"/>
+          <w:sz w:val="22"/>
+          <w:szCs w:val="22"/>
+        </w:rPr>
+        <w:t>Chengdu, China | 05-10/2019</w:t>
       </w:r>
     </w:p>
     <w:p>
@@ -2115,7 +2255,24 @@
           <w:sz w:val="22"/>
           <w:szCs w:val="22"/>
         </w:rPr>
-        <w:t>| UCSB, Four “I”s lab                                                        Santa Barbara, CA | 06-08/2019</w:t>
+        <w:t xml:space="preserve">| UCSB, Four “I”s lab                                                        </w:t>
+      </w:r>
+      <w:r>
+        <w:rPr>
+          <w:rFonts w:hint="eastAsia" w:ascii="Times New Roman" w:hAnsi="Times New Roman" w:eastAsia="宋体" w:cs="Times New Roman"/>
+          <w:sz w:val="22"/>
+          <w:szCs w:val="22"/>
+          <w:lang w:val="en-US" w:eastAsia="zh-CN"/>
+        </w:rPr>
+        <w:t xml:space="preserve">    </w:t>
+      </w:r>
+      <w:r>
+        <w:rPr>
+          <w:rFonts w:ascii="Times New Roman" w:hAnsi="Times New Roman" w:eastAsia="宋体" w:cs="Times New Roman"/>
+          <w:sz w:val="22"/>
+          <w:szCs w:val="22"/>
+        </w:rPr>
+        <w:t>Santa Barbara, CA | 06-08/2019</w:t>
       </w:r>
     </w:p>
     <w:p>
@@ -2630,6 +2787,112 @@
           <w:szCs w:val="22"/>
         </w:rPr>
         <w:t>International Workshop on Bio-Design Automation (IWBDA’22), Poster Presentation                                              10/2022</w:t>
+      </w:r>
+    </w:p>
+    <w:p>
+      <w:pPr>
+        <w:pBdr>
+          <w:bottom w:val="single" w:color="auto" w:sz="4" w:space="0"/>
+        </w:pBdr>
+        <w:spacing w:after="100"/>
+        <w:rPr>
+          <w:rFonts w:ascii="Times New Roman" w:hAnsi="Times New Roman" w:cs="Times New Roman"/>
+          <w:b/>
+          <w:sz w:val="24"/>
+          <w:shd w:val="pct15" w:color="auto" w:fill="FFFFFF"/>
+        </w:rPr>
+      </w:pPr>
+      <w:r>
+        <w:rPr>
+          <w:rFonts w:ascii="Times New Roman" w:hAnsi="Times New Roman" w:cs="Times New Roman"/>
+          <w:b/>
+          <w:sz w:val="24"/>
+          <w:shd w:val="pct15" w:color="auto" w:fill="FFFFFF"/>
+        </w:rPr>
+        <w:t>JOURNAL REVIEWER</w:t>
+      </w:r>
+    </w:p>
+    <w:p>
+      <w:pPr>
+        <w:rPr>
+          <w:rFonts w:ascii="Times New Roman" w:hAnsi="Times New Roman" w:eastAsia="宋体" w:cs="Times New Roman"/>
+          <w:sz w:val="22"/>
+          <w:szCs w:val="22"/>
+        </w:rPr>
+      </w:pPr>
+      <w:r>
+        <w:rPr>
+          <w:rFonts w:ascii="Times New Roman" w:hAnsi="Times New Roman" w:eastAsia="宋体" w:cs="Times New Roman"/>
+          <w:sz w:val="22"/>
+          <w:szCs w:val="22"/>
+        </w:rPr>
+        <w:t xml:space="preserve">IEEE Transactions on Computer-Aided Design of Integrated Circuits and Systems (IEEE-TCAD)                         </w:t>
+      </w:r>
+    </w:p>
+    <w:p>
+      <w:pPr>
+        <w:rPr>
+          <w:rFonts w:ascii="Times New Roman" w:hAnsi="Times New Roman" w:eastAsia="宋体" w:cs="Times New Roman"/>
+          <w:sz w:val="22"/>
+          <w:szCs w:val="22"/>
+        </w:rPr>
+      </w:pPr>
+      <w:r>
+        <w:rPr>
+          <w:rFonts w:ascii="Times New Roman" w:hAnsi="Times New Roman" w:eastAsia="宋体" w:cs="Times New Roman"/>
+          <w:sz w:val="22"/>
+          <w:szCs w:val="22"/>
+        </w:rPr>
+        <w:t>eLife</w:t>
+      </w:r>
+      <w:r>
+        <w:rPr>
+          <w:rFonts w:hint="eastAsia" w:ascii="Times New Roman" w:hAnsi="Times New Roman" w:eastAsia="宋体" w:cs="Times New Roman"/>
+          <w:sz w:val="22"/>
+          <w:szCs w:val="22"/>
+        </w:rPr>
+        <w:t xml:space="preserve">          </w:t>
+      </w:r>
+      <w:r>
+        <w:rPr>
+          <w:rFonts w:ascii="Times New Roman" w:hAnsi="Times New Roman" w:eastAsia="宋体" w:cs="Times New Roman"/>
+          <w:sz w:val="22"/>
+          <w:szCs w:val="22"/>
+        </w:rPr>
+        <w:t xml:space="preserve">                                                                                                                                                               </w:t>
+      </w:r>
+    </w:p>
+    <w:p>
+      <w:pPr>
+        <w:keepNext w:val="0"/>
+        <w:keepLines w:val="0"/>
+        <w:pageBreakBefore w:val="0"/>
+        <w:widowControl w:val="0"/>
+        <w:kinsoku/>
+        <w:wordWrap/>
+        <w:overflowPunct/>
+        <w:topLinePunct w:val="0"/>
+        <w:autoSpaceDE/>
+        <w:autoSpaceDN/>
+        <w:bidi w:val="0"/>
+        <w:adjustRightInd/>
+        <w:snapToGrid/>
+        <w:spacing w:after="200"/>
+        <w:jc w:val="both"/>
+        <w:textAlignment w:val="auto"/>
+        <w:rPr>
+          <w:rFonts w:ascii="Times New Roman" w:hAnsi="Times New Roman" w:cs="Times New Roman"/>
+          <w:sz w:val="22"/>
+          <w:szCs w:val="22"/>
+        </w:rPr>
+      </w:pPr>
+      <w:r>
+        <w:rPr>
+          <w:rFonts w:ascii="Times New Roman" w:hAnsi="Times New Roman" w:eastAsia="宋体" w:cs="Times New Roman"/>
+          <w:sz w:val="22"/>
+          <w:szCs w:val="22"/>
+        </w:rPr>
+        <w:t xml:space="preserve">International Conference on Computer-Aided Design (ICCAD’22)    </w:t>
       </w:r>
     </w:p>
     <w:p>
@@ -2706,122 +2969,6 @@
           <w:szCs w:val="22"/>
         </w:rPr>
         <w:t xml:space="preserve">              02/2024-Now</w:t>
-      </w:r>
-    </w:p>
-    <w:p>
-      <w:pPr>
-        <w:pBdr>
-          <w:bottom w:val="single" w:color="auto" w:sz="4" w:space="0"/>
-        </w:pBdr>
-        <w:spacing w:after="100"/>
-        <w:rPr>
-          <w:rFonts w:ascii="Times New Roman" w:hAnsi="Times New Roman" w:cs="Times New Roman"/>
-          <w:b/>
-          <w:sz w:val="24"/>
-          <w:shd w:val="pct15" w:color="auto" w:fill="FFFFFF"/>
-        </w:rPr>
-      </w:pPr>
-      <w:r>
-        <w:rPr>
-          <w:rFonts w:ascii="Times New Roman" w:hAnsi="Times New Roman" w:cs="Times New Roman"/>
-          <w:b/>
-          <w:sz w:val="24"/>
-          <w:shd w:val="pct15" w:color="auto" w:fill="FFFFFF"/>
-        </w:rPr>
-        <w:t>JOURNAL REVIEWER</w:t>
-      </w:r>
-    </w:p>
-    <w:p>
-      <w:pPr>
-        <w:rPr>
-          <w:rFonts w:ascii="Times New Roman" w:hAnsi="Times New Roman" w:eastAsia="宋体" w:cs="Times New Roman"/>
-          <w:sz w:val="22"/>
-          <w:szCs w:val="22"/>
-        </w:rPr>
-      </w:pPr>
-      <w:r>
-        <w:rPr>
-          <w:rFonts w:ascii="Times New Roman" w:hAnsi="Times New Roman" w:eastAsia="宋体" w:cs="Times New Roman"/>
-          <w:sz w:val="22"/>
-          <w:szCs w:val="22"/>
-        </w:rPr>
-        <w:t xml:space="preserve">IEEE Transactions on Computer-Aided Design of Integrated Circuits and Systems (IEEE-TCAD)                         </w:t>
-      </w:r>
-    </w:p>
-    <w:p>
-      <w:pPr>
-        <w:rPr>
-          <w:rFonts w:ascii="Times New Roman" w:hAnsi="Times New Roman" w:eastAsia="宋体" w:cs="Times New Roman"/>
-          <w:sz w:val="22"/>
-          <w:szCs w:val="22"/>
-        </w:rPr>
-      </w:pPr>
-      <w:r>
-        <w:rPr>
-          <w:rFonts w:ascii="Times New Roman" w:hAnsi="Times New Roman" w:eastAsia="宋体" w:cs="Times New Roman"/>
-          <w:sz w:val="22"/>
-          <w:szCs w:val="22"/>
-        </w:rPr>
-        <w:t>eLife</w:t>
-      </w:r>
-      <w:r>
-        <w:rPr>
-          <w:rFonts w:hint="eastAsia" w:ascii="Times New Roman" w:hAnsi="Times New Roman" w:eastAsia="宋体" w:cs="Times New Roman"/>
-          <w:sz w:val="22"/>
-          <w:szCs w:val="22"/>
-        </w:rPr>
-        <w:t xml:space="preserve">          </w:t>
-      </w:r>
-      <w:r>
-        <w:rPr>
-          <w:rFonts w:ascii="Times New Roman" w:hAnsi="Times New Roman" w:eastAsia="宋体" w:cs="Times New Roman"/>
-          <w:sz w:val="22"/>
-          <w:szCs w:val="22"/>
-        </w:rPr>
-        <w:t xml:space="preserve">                                                                            </w:t>
-      </w:r>
-      <w:bookmarkStart w:id="2" w:name="_GoBack"/>
-      <w:bookmarkEnd w:id="2"/>
-      <w:r>
-        <w:rPr>
-          <w:rFonts w:ascii="Times New Roman" w:hAnsi="Times New Roman" w:eastAsia="宋体" w:cs="Times New Roman"/>
-          <w:sz w:val="22"/>
-          <w:szCs w:val="22"/>
-        </w:rPr>
-        <w:t xml:space="preserve">                                                                                   </w:t>
-      </w:r>
-    </w:p>
-    <w:p>
-      <w:pPr>
-        <w:keepNext w:val="0"/>
-        <w:keepLines w:val="0"/>
-        <w:pageBreakBefore w:val="0"/>
-        <w:widowControl w:val="0"/>
-        <w:kinsoku/>
-        <w:wordWrap/>
-        <w:overflowPunct/>
-        <w:topLinePunct w:val="0"/>
-        <w:autoSpaceDE/>
-        <w:autoSpaceDN/>
-        <w:bidi w:val="0"/>
-        <w:adjustRightInd/>
-        <w:snapToGrid/>
-        <w:spacing w:after="200"/>
-        <w:jc w:val="both"/>
-        <w:textAlignment w:val="auto"/>
-        <w:rPr>
-          <w:rFonts w:ascii="Times New Roman" w:hAnsi="Times New Roman" w:cs="Times New Roman"/>
-          <w:sz w:val="22"/>
-          <w:szCs w:val="22"/>
-        </w:rPr>
-      </w:pPr>
-      <w:r>
-        <w:rPr>
-          <w:rFonts w:ascii="Times New Roman" w:hAnsi="Times New Roman" w:eastAsia="宋体" w:cs="Times New Roman"/>
-          <w:sz w:val="22"/>
-          <w:szCs w:val="22"/>
-        </w:rPr>
-        <w:t xml:space="preserve">International Conference on Computer-Aided Design (ICCAD’22)    </w:t>
       </w:r>
     </w:p>
     <w:p>
@@ -4036,7 +4183,7 @@
   <w:docDefaults>
     <w:rPrDefault>
       <w:rPr>
-        <w:rFonts w:asciiTheme="minorHAnsi" w:hAnsiTheme="minorHAnsi" w:eastAsiaTheme="minorEastAsia" w:cstheme="minorBidi"/>
+        <w:rFonts w:ascii="Times New Roman" w:hAnsi="Times New Roman" w:eastAsia="宋体" w:cs="Times New Roman"/>
       </w:rPr>
     </w:rPrDefault>
     <w:pPrDefault/>

</xml_diff>

<commit_message>
Update CV to August 2026 version.
EOF

Co-authored-by: Cursor <cursoragent@cursor.com>
</commit_message>
<xml_diff>
--- a/CV_zyrr.docx
+++ b/CV_zyrr.docx
@@ -1,6 +1,6 @@
 
 <file path=word/document.xml><?xml version="1.0" encoding="utf-8"?>
-<w:document xmlns:wpc="http://schemas.microsoft.com/office/word/2010/wordprocessingCanvas" xmlns:mc="http://schemas.openxmlformats.org/markup-compatibility/2006" xmlns:o="urn:schemas-microsoft-com:office:office" xmlns:r="http://schemas.openxmlformats.org/officeDocument/2006/relationships" xmlns:m="http://schemas.openxmlformats.org/officeDocument/2006/math" xmlns:v="urn:schemas-microsoft-com:vml" xmlns:wp14="http://schemas.microsoft.com/office/word/2010/wordprocessingDrawing" xmlns:wp="http://schemas.openxmlformats.org/drawingml/2006/wordprocessingDrawing" xmlns:w="http://schemas.openxmlformats.org/wordprocessingml/2006/main" xmlns:w14="http://schemas.microsoft.com/office/word/2010/wordml" xmlns:w10="urn:schemas-microsoft-com:office:word" xmlns:w15="http://schemas.microsoft.com/office/word/2012/wordml" xmlns:wpg="http://schemas.microsoft.com/office/word/2010/wordprocessingGroup" xmlns:wpi="http://schemas.microsoft.com/office/word/2010/wordprocessingInk" xmlns:wne="http://schemas.microsoft.com/office/word/2006/wordml" xmlns:wps="http://schemas.microsoft.com/office/word/2010/wordprocessingShape" xmlns:wpsCustomData="http://www.wps.cn/officeDocument/2013/wpsCustomData" mc:Ignorable="w14 w15 wp14">
+<w:document xmlns:wpc="http://schemas.microsoft.com/office/word/2010/wordprocessingCanvas" xmlns:cx="http://schemas.microsoft.com/office/drawing/2014/chartex" xmlns:cx1="http://schemas.microsoft.com/office/drawing/2015/9/8/chartex" xmlns:cx2="http://schemas.microsoft.com/office/drawing/2015/10/21/chartex" xmlns:cx3="http://schemas.microsoft.com/office/drawing/2016/5/9/chartex" xmlns:cx4="http://schemas.microsoft.com/office/drawing/2016/5/10/chartex" xmlns:cx5="http://schemas.microsoft.com/office/drawing/2016/5/11/chartex" xmlns:cx6="http://schemas.microsoft.com/office/drawing/2016/5/12/chartex" xmlns:cx7="http://schemas.microsoft.com/office/drawing/2016/5/13/chartex" xmlns:cx8="http://schemas.microsoft.com/office/drawing/2016/5/14/chartex" xmlns:mc="http://schemas.openxmlformats.org/markup-compatibility/2006" xmlns:o="urn:schemas-microsoft-com:office:office" xmlns:r="http://schemas.openxmlformats.org/officeDocument/2006/relationships" xmlns:m="http://schemas.openxmlformats.org/officeDocument/2006/math" xmlns:v="urn:schemas-microsoft-com:vml" xmlns:wp14="http://schemas.microsoft.com/office/word/2010/wordprocessingDrawing" xmlns:wp="http://schemas.openxmlformats.org/drawingml/2006/wordprocessingDrawing" xmlns:w="http://schemas.openxmlformats.org/wordprocessingml/2006/main" xmlns:w14="http://schemas.microsoft.com/office/word/2010/wordml" xmlns:w10="urn:schemas-microsoft-com:office:word" xmlns:w15="http://schemas.microsoft.com/office/word/2012/wordml" xmlns:wpg="http://schemas.microsoft.com/office/word/2010/wordprocessingGroup" xmlns:wpi="http://schemas.microsoft.com/office/word/2010/wordprocessingInk" xmlns:wne="http://schemas.microsoft.com/office/word/2006/wordml" xmlns:wps="http://schemas.microsoft.com/office/word/2010/wordprocessingShape" xmlns:wpsCustomData="http://www.wps.cn/officeDocument/2013/wpsCustomData" mc:Ignorable="w14 w15 wp14">
   <w:body>
     <w:p>
       <w:pPr>
@@ -331,6 +331,8 @@
         </w:rPr>
         <w:t xml:space="preserve"> 3.94/4.00 (Rank: 6/740)</w:t>
       </w:r>
+      <w:bookmarkStart w:id="2" w:name="_GoBack"/>
+      <w:bookmarkEnd w:id="2"/>
     </w:p>
     <w:p>
       <w:pPr>
@@ -430,7 +432,7 @@
           <w:rFonts w:hint="eastAsia" w:ascii="Times New Roman" w:hAnsi="Times New Roman" w:cs="Times New Roman"/>
           <w:sz w:val="24"/>
         </w:rPr>
-        <w:t>Computer scientist developing algorithms, programming languages, and AI-driven software infrastructures for biological engineering. My research focuses on translating complex biological design problems into computational abstractions that enable optimization, automation, and scalable scientific discovery.</w:t>
+        <w:t>Computer scientist developing algorithms, programming languages, and AI-driven software infrastructures for biological engineering. with a focus on computational design automation, scientific programming languages, and autonomous laboratory systems.</w:t>
       </w:r>
       <w:r>
         <w:rPr>
@@ -1856,8 +1858,6 @@
         </w:rPr>
         <w:t>.</w:t>
       </w:r>
-      <w:bookmarkStart w:id="2" w:name="_GoBack"/>
-      <w:bookmarkEnd w:id="2"/>
     </w:p>
     <w:p>
       <w:pPr>

</xml_diff>